<commit_message>
Explain font feelings through matched meme comparisons across the book
</commit_message>
<xml_diff>
--- a/submission-28p/Planning_28p_GoogleDocs.docx
+++ b/submission-28p/Planning_28p_GoogleDocs.docx
@@ -22,7 +22,7 @@
     </w:p>
     <w:p>
       <w:r>
-        <w:t>책 제목은 「마참내! 폰트도 웃길 수 있다」다. 친구들이 단체 채팅방에서 주고받는 밈 11개와 어울리는 서체를 모았다. 먼저 웃고 글자의 형태를 살펴본 뒤, 상황에 맞는 한마디를 다시 써먹을 수 있는 선물책을 만든다.</w:t>
+        <w:t>책 제목은 「마참내! 폰트도 웃길 수 있다」다. 친구들이 단체 채팅방에서 주고받는 밈 11개를 통해 서체가 말투를 어떻게 바꾸는지 보여준다. 같은 말의 서체를 바꿔 보고, 글자 형태와 밈의 감정이 어긋나며 생기는 웃음을 살펴보는 선물책을 만든다.</w:t>
       </w:r>
     </w:p>
     <w:p>
@@ -36,7 +36,7 @@
     </w:p>
     <w:p>
       <w:r>
-        <w:t>서체의 이름만 나열하는 대신, 밈의 감정과 글자의 모양을 짝짓는다. 굵은 직선은 외침을, 고른 획은 조심스러운 혼잣말을, 획의 대비와 장식은 과한 고백을 어떻게 만들 수 있는지 지면에서 보여준다. 같은 문장이 서체·크기·행간에 따라 달리 들린다는 점을 독자가 직접 비교하게 한다.</w:t>
+        <w:t>각 서체의 형태를 관찰하고, 그 형태가 이 문맥에서 만드는 말투와 웃음의 이유를 연결한다. 예스체는 기세가 남은 반성, 고딕은 담담한 자기비하, 명조는 비장한 참회처럼 읽히는 차이를 보여준다. 같은 문구의 크기와 굵기 이름을 맞춰 서체를 비교하고, 크기·행간으로 생기는 효과는 따로 설명한다.</w:t>
       </w:r>
     </w:p>
     <w:p>
@@ -69,7 +69,7 @@
     </w:p>
     <w:p>
       <w:r>
-        <w:t>• 오른쪽에서 사용 상황, 실제 서체, 획과 간격의 특징을 읽는다.</w:t>
+        <w:t>• 오른쪽에서 같은 문장의 서체를 비교하고 형태·말투·웃음의 이유를 읽는다.</w:t>
       </w:r>
     </w:p>
     <w:p>
@@ -381,7 +381,7 @@
                 <w:color w:val="000000"/>
                 <w:sz w:val="18"/>
               </w:rPr>
-              <w:t>원문 11개와 해설 11개 펼침면, 차례·비교 견본·출처</w:t>
+              <w:t>원문 11개와 해설 11개 펼침면, 서체 지도·비교 견본·출처</w:t>
             </w:r>
           </w:p>
         </w:tc>
@@ -523,7 +523,7 @@
         <w:pStyle w:val="Caption"/>
       </w:pPr>
       <w:r>
-        <w:t>무드보드  선정한 밈 사진의 배경 분리 편집본, 표지·AA·장문 지면, 실제 서체 견본과 강조색을 바탕으로 구성했다. 사진의 최초 출처는 확인되지 않았다.</w:t>
+        <w:t>무드보드  흰 표지와 밈 사진, 두 서체를 비교하는 해설, 세 서체 실험실과 강조색을 묶었다. 사진의 최초 출처는 확인되지 않았다.</w:t>
       </w:r>
     </w:p>
     <w:p>
@@ -542,7 +542,7 @@
     </w:p>
     <w:p>
       <w:r>
-        <w:t>표지는 흰 배경에 ‘무섭다’ 사진을 크게 놓고 검정 예스체 제목을 더한다. 사진 속 빨간 말풍선이 강조색의 기준이 된다. 해설 쪽의 여백과 항목 위치는 일정하게 유지해 웃긴 장면 뒤에서도 정보를 찾기 쉽게 한다.</w:t>
+        <w:t>표지는 흰 배경에 ‘무섭다’ 사진을 크게 놓고 검정 예스체 제목을 더한다. 사진 속 빨간 말풍선이 강조색의 기준이 된다. 해설 쪽은 같은 문장을 두 서체로 읽은 뒤, 글자 형태와 들리는 말투, 밈과 만나 웃기는 이유를 순서대로 살펴보게 한다.</w:t>
       </w:r>
     </w:p>
     <w:p>
@@ -556,12 +556,12 @@
         <w:keepNext/>
       </w:pPr>
       <w:r>
-        <w:t>실제 서체와 형태 분석</w:t>
+        <w:t>세 서체의 형태와 말투 비교</w:t>
       </w:r>
     </w:p>
     <w:p>
       <w:r>
-        <w:t>예스체 Regular를 표지와 해설의 기준 서체로 유지한다. 일부 밈 원문과 견본에는 Noto Sans·Serif를 실제 적용해 말투를 다르게 만든다. Regular 한 종만 있는 예스체는 없는 Bold를 합성하지 않고, 크기와 색·간격으로 강약을 조절한다.</w:t>
+        <w:t>예스체를 표지와 해설의 기준으로 삼고 Noto 고딕·명조를 비교한다. 아래 인상은 이 책의 문구에서 읽히는 해석이며, 서체의 고정된 성격은 아니다. Regular끼리도 실제 획의 무게는 다르다. 예스체에 없는 Bold는 합성하지 않는다.</w:t>
       </w:r>
     </w:p>
     <w:p>
@@ -609,7 +609,7 @@
         <w:pStyle w:val="Caption"/>
       </w:pPr>
       <w:r>
-        <w:t>형태 비교 견본  세 서체 모두 같은 문구와 같은 크기로 렌더했다. 책 26쪽에서는 Regular 28pt로 비교한다.</w:t>
+        <w:t>같은 「내가 감히」도 예스체는 기세가 남은 반성, 고딕은 담담한 자기비하, 명조는 비장한 참회로 읽힌다. 책 26쪽은 모두 Regular 28pt다.</w:t>
       </w:r>
     </w:p>
     <w:tbl>
@@ -692,7 +692,7 @@
                 <w:color w:val="FFFFFF"/>
                 <w:sz w:val="18"/>
               </w:rPr>
-              <w:t>형태와 인상</w:t>
+              <w:t>형태에서 읽히는 말투</w:t>
             </w:r>
           </w:p>
         </w:tc>
@@ -725,7 +725,7 @@
                 <w:color w:val="FFFFFF"/>
                 <w:sz w:val="18"/>
               </w:rPr>
-              <w:t>실제 지면 역할</w:t>
+              <w:t>이 문구에서 웃기는 이유</w:t>
             </w:r>
           </w:p>
         </w:tc>
@@ -799,7 +799,7 @@
                 <w:color w:val="000000"/>
                 <w:sz w:val="18"/>
               </w:rPr>
-              <w:t>단단한 직선 골격과 짙은 획. 짧은 외침과 선언의 단호함.</w:t>
+              <w:t>짙은 획과 직선 골격이 짧은 말을 단호하게 세운다.</w:t>
             </w:r>
           </w:p>
         </w:tc>
@@ -832,7 +832,7 @@
                 <w:color w:val="000000"/>
                 <w:sz w:val="18"/>
               </w:rPr>
-              <w:t>표지·해설과 다수 밈의 기준 서체</w:t>
+              <w:t>반성하는 말인데 항의문처럼 힘이 남아 머쓱해진다.</w:t>
             </w:r>
           </w:p>
         </w:tc>
@@ -906,7 +906,7 @@
                 <w:color w:val="000000"/>
                 <w:sz w:val="18"/>
               </w:rPr>
-              <w:t>비교적 고른 획과 절제된 검은 면적. 조심스러운 혼잣말.</w:t>
+              <w:t>획 굵기 차이가 작고 끝 장식이 적어 담담하게 읽힌다.</w:t>
             </w:r>
           </w:p>
         </w:tc>
@@ -939,7 +939,7 @@
                 <w:color w:val="000000"/>
                 <w:sz w:val="18"/>
               </w:rPr>
-              <w:t>A03 원문·견본, 26쪽 비교</w:t>
+              <w:t>과한 자기비하를 공지문처럼 차분히 말하는 온도 차이가 난다.</w:t>
             </w:r>
           </w:p>
         </w:tc>
@@ -1013,7 +1013,7 @@
                 <w:color w:val="000000"/>
                 <w:sz w:val="18"/>
               </w:rPr>
-              <w:t>굵고 가는 획의 대비와 획 끝 장식. 다정함·고백의 여운.</w:t>
+              <w:t>굵고 가는 획과 끝 장식이 격식 있는 여운을 만든다.</w:t>
             </w:r>
           </w:p>
         </w:tc>
@@ -1046,7 +1046,7 @@
                 <w:color w:val="000000"/>
                 <w:sz w:val="18"/>
               </w:rPr>
-              <w:t>A04·A02 원문·견본, 26쪽 비교</w:t>
+              <w:t>사소한 머쓱함을 장편 참회처럼 대하는 과장이 생긴다.</w:t>
             </w:r>
           </w:p>
         </w:tc>
@@ -1085,9 +1085,9 @@
                 <w:color w:val="000000"/>
                 <w:sz w:val="18"/>
               </w:rPr>
-              <w:t>Noto 지원 서체와</w:t>
+              <w:t>특수 문자</w:t>
               <w:br/>
-              <w:t>DejaVu Sans Mono</w:t>
+              <w:t>지원 서체</w:t>
             </w:r>
           </w:p>
         </w:tc>
@@ -1120,7 +1120,7 @@
                 <w:color w:val="000000"/>
                 <w:sz w:val="18"/>
               </w:rPr>
-              <w:t>고정폭 공백·점자·복합 표정·사람 이모지 등 특수 문자 지원.</w:t>
+              <w:t>Noto 지원 서체와 DejaVu Sans Mono로 AA·이모지 형상을 보존한다.</w:t>
             </w:r>
           </w:p>
         </w:tc>
@@ -1153,7 +1153,7 @@
                 <w:color w:val="000000"/>
                 <w:sz w:val="18"/>
               </w:rPr>
-              <w:t>A01·B02·B04의 벡터 형상</w:t>
+              <w:t>AA 원형의 표정과 해설의 말투를 구분해 읽는다.</w:t>
             </w:r>
           </w:p>
         </w:tc>
@@ -1194,7 +1194,7 @@
     </w:p>
     <w:p>
       <w:r>
-        <w:t>한 펼침면에서 밈 하나에 집중한다. 짝수 쪽은 원문과 형상을 크게 보여주고, 다음 홀수 쪽은 상황·실제 서체·선정 이유·인상과 예문을 담는다.</w:t>
+        <w:t>한 펼침면에서 밈 하나에 집중한다. 짝수 쪽은 원문과 형상을, 다음 홀수 쪽은 같은 문장의 서체 비교·형태·말투·웃음의 이유·사용 예문을 담는다.</w:t>
       </w:r>
     </w:p>
     <w:tbl>
@@ -1592,7 +1592,7 @@
                 <w:color w:val="000000"/>
                 <w:sz w:val="18"/>
               </w:rPr>
-              <w:t>들어가며</w:t>
+              <w:t>들어가며와 세 서체 지도</w:t>
             </w:r>
           </w:p>
         </w:tc>
@@ -1625,7 +1625,7 @@
                 <w:color w:val="000000"/>
                 <w:sz w:val="18"/>
               </w:rPr>
-              <w:t>읽는 순서·원문 보존 안내</w:t>
+              <w:t>알겠어 동일 23pt 비교와 말투 안내</w:t>
             </w:r>
           </w:p>
         </w:tc>
@@ -1835,7 +1835,7 @@
                 <w:color w:val="000000"/>
                 <w:sz w:val="18"/>
               </w:rPr>
-              <w:t>상황·실제 서체·형태 분석·인상·예문 / A01</w:t>
+              <w:t>동일 문구 서체 비교·형태·말투·웃음·예문 / A01</w:t>
             </w:r>
           </w:p>
         </w:tc>
@@ -2045,7 +2045,7 @@
                 <w:color w:val="000000"/>
                 <w:sz w:val="18"/>
               </w:rPr>
-              <w:t>상황·실제 서체·형태 분석·인상·예문 / B01</w:t>
+              <w:t>동일 문구 서체 비교·형태·말투·웃음·예문 / B01</w:t>
             </w:r>
           </w:p>
         </w:tc>
@@ -2255,7 +2255,7 @@
                 <w:color w:val="000000"/>
                 <w:sz w:val="18"/>
               </w:rPr>
-              <w:t>Noto Serif의 획 대비·장식과 고백의 여운 / A04</w:t>
+              <w:t>동일 문구 서체 비교·형태·말투·웃음·예문 / A04</w:t>
             </w:r>
           </w:p>
         </w:tc>
@@ -2465,7 +2465,7 @@
                 <w:color w:val="000000"/>
                 <w:sz w:val="18"/>
               </w:rPr>
-              <w:t>상황·실제 서체·형태 분석·인상·예문 / B02</w:t>
+              <w:t>동일 문구 서체 비교·형태·말투·웃음·예문 / B02</w:t>
             </w:r>
           </w:p>
         </w:tc>
@@ -2675,7 +2675,7 @@
                 <w:color w:val="000000"/>
                 <w:sz w:val="18"/>
               </w:rPr>
-              <w:t>Noto Serif의 여운·쉼표·감정의 목록 / A02</w:t>
+              <w:t>동일 문구 서체 비교·형태·말투·웃음·예문 / A02</w:t>
             </w:r>
           </w:p>
         </w:tc>
@@ -2885,7 +2885,7 @@
                 <w:color w:val="000000"/>
                 <w:sz w:val="18"/>
               </w:rPr>
-              <w:t>Noto Sans의 고른 획·작아지는 크기와 자기반성 / A03</w:t>
+              <w:t>동일 문구 서체 비교·형태·말투·웃음·예문 / A03</w:t>
             </w:r>
           </w:p>
         </w:tc>
@@ -2893,7 +2893,7 @@
     </w:tbl>
     <w:p>
       <w:r>
-        <w:t>원문과 해설의 위치를 반복해 독자가 읽는 방식을 익히게 한다. 다정함·질투·자기반성을 다루는 A04·A02·A03에는 실제 Noto 견본을 적용해 예스체와 다른 말투를 확인할 수 있게 한다.</w:t>
+        <w:t>3쪽의 「알겠어」는 세 서체 모두 23pt로 보여주는 입문 지도다. 각 해설에서 두 서체를 직접 비교하고, 26쪽의 「내가 감히」는 세 서체 28pt로 읽어 감정 차이와 웃음의 이유를 다시 확인한다.</w:t>
       </w:r>
     </w:p>
     <w:p>
@@ -3233,7 +3233,7 @@
                 <w:color w:val="000000"/>
                 <w:sz w:val="18"/>
               </w:rPr>
-              <w:t>상황·실제 서체·형태 분석·인상·예문 / B06</w:t>
+              <w:t>동일 문구 서체 비교·형태·말투·웃음·예문 / B06</w:t>
             </w:r>
           </w:p>
         </w:tc>
@@ -3443,7 +3443,7 @@
                 <w:color w:val="000000"/>
                 <w:sz w:val="18"/>
               </w:rPr>
-              <w:t>상황·실제 서체·형태 분석·인상·예문 / B05</w:t>
+              <w:t>동일 문구 서체 비교·형태·말투·웃음·예문 / B05</w:t>
             </w:r>
           </w:p>
         </w:tc>
@@ -3653,7 +3653,7 @@
                 <w:color w:val="000000"/>
                 <w:sz w:val="18"/>
               </w:rPr>
-              <w:t>상황·실제 서체·형태 분석·인상·예문 / B03</w:t>
+              <w:t>동일 문구 서체 비교·형태·말투·웃음·예문 / B03</w:t>
             </w:r>
           </w:p>
         </w:tc>
@@ -3863,7 +3863,7 @@
                 <w:color w:val="000000"/>
                 <w:sz w:val="18"/>
               </w:rPr>
-              <w:t>상황·실제 서체·형태 분석·인상·예문 / B04</w:t>
+              <w:t>동일 문구 서체 비교·형태·말투·웃음·예문 / B04</w:t>
             </w:r>
           </w:p>
         </w:tc>
@@ -4073,7 +4073,7 @@
                 <w:color w:val="000000"/>
                 <w:sz w:val="18"/>
               </w:rPr>
-              <w:t>상황·실제 서체·형태 분석·인상·예문 / B07</w:t>
+              <w:t>동일 문구 서체 비교·형태·말투·웃음·예문 / B07</w:t>
             </w:r>
           </w:p>
         </w:tc>
@@ -4178,7 +4178,7 @@
                 <w:color w:val="000000"/>
                 <w:sz w:val="18"/>
               </w:rPr>
-              <w:t>예스체·Noto Sans·Noto Serif로 동일 문구 비교 / A03</w:t>
+              <w:t>내가 감히 동일 28pt 비교와 웃음의 이유 / A03</w:t>
             </w:r>
           </w:p>
         </w:tc>
@@ -4998,7 +4998,7 @@
     </w:p>
     <w:p>
       <w:r>
-        <w:t>• 예스체를 기준으로 정하고, 일부 Noto 견본과 특수 문자 지원 서체를 실제 지면에 적용했다.</w:t>
+        <w:t>• 같은 문장의 서체 비교와 형태·말투·웃음의 이유를 모든 해설에 넣었다.</w:t>
       </w:r>
     </w:p>
     <w:p>
@@ -5008,7 +5008,7 @@
     </w:p>
     <w:p>
       <w:r>
-        <w:t>• 6주차 과제에 맞춰 28쪽으로 재편집하고 A3 실제 크기 출력 파일을 별도로 준비한다.</w:t>
+        <w:t>• 28쪽 전체 디자인과 A3 실제 크기 출력용 파일을 함께 정리했다.</w:t>
       </w:r>
     </w:p>
     <w:p>

</xml_diff>

<commit_message>
Reduce specimen sizes and show feelings beside each of three fonts
</commit_message>
<xml_diff>
--- a/submission-28p/Planning_28p_GoogleDocs.docx
+++ b/submission-28p/Planning_28p_GoogleDocs.docx
@@ -22,7 +22,7 @@
     </w:p>
     <w:p>
       <w:r>
-        <w:t>책 제목은 「마참내! 폰트도 웃길 수 있다」다. 친구들이 단체 채팅방에서 주고받는 밈 11개를 통해 서체가 말투를 어떻게 바꾸는지 보여준다. 같은 말의 서체를 바꿔 보고, 글자 형태와 밈의 감정이 어긋나며 생기는 웃음을 살펴보는 선물책을 만든다.</w:t>
+        <w:t>책 제목은 「마참내! 폰트도 웃길 수 있다」다. 친구들과 주고받은 밈 11개를 통해 서체가 말투를 어떻게 바꾸는지 보여준다. 같은 말의 서체를 바꿔 보고, 글자 형태와 밈의 감정이 어긋나며 생기는 웃음을 살펴보는 선물책을 만든다.</w:t>
       </w:r>
     </w:p>
     <w:p>
@@ -36,7 +36,7 @@
     </w:p>
     <w:p>
       <w:r>
-        <w:t>각 서체의 형태를 관찰하고, 그 형태가 이 문맥에서 만드는 말투와 웃음의 이유를 연결한다. 예스체는 기세가 남은 반성, 고딕은 담담한 자기비하, 명조는 비장한 참회처럼 읽히는 차이를 보여준다. 같은 문구의 크기와 굵기 이름을 맞춰 서체를 비교하고, 크기·행간으로 생기는 효과는 따로 설명한다.</w:t>
+        <w:t>각 서체의 형태를 관찰하고, 그 형태가 이 문맥에서 만드는 말투와 웃음의 이유를 연결한다. 예스체는 기세가 남은 반성, 고딕은 담담한 자기비하, 명조는 비장한 참회처럼 읽히는 차이를 보여준다. 견본의 크기를 줄여 세 서체와 느낌 설명을 함께 보여준다. 각 해설은 같은 발췌문을 15pt로 비교하고, 3쪽과 26쪽의 견본은 16pt로 맞춘다.</w:t>
       </w:r>
     </w:p>
     <w:p>
@@ -69,7 +69,7 @@
     </w:p>
     <w:p>
       <w:r>
-        <w:t>• 오른쪽에서 같은 문장의 서체를 비교하고 형태·말투·웃음의 이유를 읽는다.</w:t>
+        <w:t>• 오른쪽에서 작은 견본 세 개를 비교하고 서체별 느낌과 그 이유를 읽는다.</w:t>
       </w:r>
     </w:p>
     <w:p>
@@ -475,7 +475,7 @@
     </w:p>
     <w:p>
       <w:r>
-        <w:t>B급 감성이 분명히 드러나도록 콘셉트를 구체화했다. 비뚤어진 빨간 타원 도장, 낡은 웹 배너 같은 별표와 느낌표, 분홍·노랑 면, 과하게 큰 문구로 의도된 촌스러움을 만든다. 허술함은 새로 쓴 스티커와 캡션에서 연출하고, 원문의 철자와 공백은 그대로 보존한다.</w:t>
+        <w:t>B급 감성이 분명히 드러나도록 콘셉트를 구체화했다. 비뚤어진 빨간 타원 도장, 낡은 웹 배너 같은 별표와 느낌표, 분홍·노랑 면, 밈의 큰 문구로 의도된 촌스러움을 만든다. 해설의 제목과 견본은 작게 정리해 서체별 느낌을 읽을 공간을 확보한다. 허술함은 새로 쓴 스티커와 캡션에서 연출하고, 원문의 철자와 공백은 그대로 보존한다.</w:t>
       </w:r>
     </w:p>
     <w:p>
@@ -523,7 +523,7 @@
         <w:pStyle w:val="Caption"/>
       </w:pPr>
       <w:r>
-        <w:t>무드보드  흰 표지와 밈 사진, 두 서체를 비교하는 해설, 세 서체 실험실과 강조색을 묶었다. 사진의 최초 출처는 확인되지 않았다.</w:t>
+        <w:t>무드보드  흰 표지와 밈 사진, 세 서체와 느낌을 비교하는 해설, 세 서체 실험실과 강조색을 묶었다. 사진의 최초 출처는 확인되지 않았다.</w:t>
       </w:r>
     </w:p>
     <w:p>
@@ -537,12 +537,12 @@
     </w:p>
     <w:p>
       <w:r>
-        <w:t>흰 바탕과 검정 글자로 설명을 또렷하게 하고, 빨강은 반응과 강조에 쓴다. 분홍은 과한 애정이나 감정을, 노랑은 외침과 광고 전단의 요란함을 받친다. 큰 밈 문구와 작은 폰트 분석을 마주 놓아, 과한 농담과 진지한 해설이 한 펼침면에서 만나게 한다.</w:t>
+        <w:t>흰 바탕과 검정 글자로 설명을 또렷하게 하고, 빨강은 반응과 강조에 쓴다. 분홍은 과한 애정이나 감정을, 노랑은 외침과 광고 전단의 요란함을 받친다. 왼쪽의 밈 문구와 오른쪽의 작은 견본·느낌 설명을 마주 놓는다. 해설 제목은 18pt, 세 견본은 15pt로 줄이고 서체별 인상과 형태적 이유를 함께 보여준다.</w:t>
       </w:r>
     </w:p>
     <w:p>
       <w:r>
-        <w:t>표지는 흰 배경에 ‘무섭다’ 사진을 크게 놓고 검정 예스체 제목을 더한다. 사진 속 빨간 말풍선이 강조색의 기준이 된다. 해설 쪽은 같은 문장을 두 서체로 읽은 뒤, 글자 형태와 들리는 말투, 밈과 만나 웃기는 이유를 순서대로 살펴보게 한다.</w:t>
+        <w:t>표지는 흰 배경에 ‘무섭다’ 사진을 크게 놓고 검정 예스체 제목을 더한다. 사진 속 빨간 말풍선이 강조색의 기준이 된다. 해설 쪽은 같은 발췌문을 예스체·고딕·명조로 나란히 읽고, 각 서체가 주는 느낌과 그 느낌이 생기는 획의 특징을 바로 확인하게 한다.</w:t>
       </w:r>
     </w:p>
     <w:p>
@@ -609,7 +609,7 @@
         <w:pStyle w:val="Caption"/>
       </w:pPr>
       <w:r>
-        <w:t>같은 「내가 감히」도 예스체는 기세가 남은 반성, 고딕은 담담한 자기비하, 명조는 비장한 참회로 읽힌다. 책 26쪽은 모두 Regular 28pt다.</w:t>
+        <w:t>「내가 감히」는 예스체의 기세, 고딕의 담담함, 명조의 비장함으로 읽힌다. 책 26쪽 견본은 모두 Regular 16pt다.</w:t>
       </w:r>
     </w:p>
     <w:tbl>
@@ -799,7 +799,7 @@
                 <w:color w:val="000000"/>
                 <w:sz w:val="18"/>
               </w:rPr>
-              <w:t>짙은 획과 직선 골격이 짧은 말을 단호하게 세운다.</w:t>
+              <w:t>짙은 획과 직선 골격이 단호한 말투를 만든다.</w:t>
             </w:r>
           </w:p>
         </w:tc>
@@ -1013,7 +1013,7 @@
                 <w:color w:val="000000"/>
                 <w:sz w:val="18"/>
               </w:rPr>
-              <w:t>굵고 가는 획과 끝 장식이 격식 있는 여운을 만든다.</w:t>
+              <w:t>굵기 대비와 끝 장식이 격식을 더한다.</w:t>
             </w:r>
           </w:p>
         </w:tc>
@@ -1153,7 +1153,7 @@
                 <w:color w:val="000000"/>
                 <w:sz w:val="18"/>
               </w:rPr>
-              <w:t>AA 원형의 표정과 해설의 말투를 구분해 읽는다.</w:t>
+              <w:t>AA의 표정과 해설의 말투를 구분한다.</w:t>
             </w:r>
           </w:p>
         </w:tc>
@@ -1194,7 +1194,7 @@
     </w:p>
     <w:p>
       <w:r>
-        <w:t>한 펼침면에서 밈 하나에 집중한다. 짝수 쪽은 원문과 형상을, 다음 홀수 쪽은 같은 문장의 서체 비교·형태·말투·웃음의 이유·사용 예문을 담는다.</w:t>
+        <w:t>한 펼침면에서 밈 하나에 집중한다. 짝수 쪽은 원문과 형상을, 다음 홀수 쪽은 같은 발췌문을 15pt 세 서체로 보여주고, 각 서체의 느낌·형태적 이유·사용 예문을 담는다.</w:t>
       </w:r>
     </w:p>
     <w:tbl>
@@ -1625,7 +1625,7 @@
                 <w:color w:val="000000"/>
                 <w:sz w:val="18"/>
               </w:rPr>
-              <w:t>알겠어 동일 23pt 비교와 말투 안내</w:t>
+              <w:t>알겠어 동일 16pt 비교와 서체별 느낌</w:t>
             </w:r>
           </w:p>
         </w:tc>
@@ -1835,7 +1835,7 @@
                 <w:color w:val="000000"/>
                 <w:sz w:val="18"/>
               </w:rPr>
-              <w:t>동일 문구 서체 비교·형태·말투·웃음·예문 / A01</w:t>
+              <w:t>같은 발췌문 15pt 세 서체·각 서체의 느낌과 형태 근거 / A01</w:t>
             </w:r>
           </w:p>
         </w:tc>
@@ -2045,7 +2045,7 @@
                 <w:color w:val="000000"/>
                 <w:sz w:val="18"/>
               </w:rPr>
-              <w:t>동일 문구 서체 비교·형태·말투·웃음·예문 / B01</w:t>
+              <w:t>같은 발췌문 15pt 세 서체·각 서체의 느낌과 형태 근거 / B01</w:t>
             </w:r>
           </w:p>
         </w:tc>
@@ -2255,7 +2255,7 @@
                 <w:color w:val="000000"/>
                 <w:sz w:val="18"/>
               </w:rPr>
-              <w:t>동일 문구 서체 비교·형태·말투·웃음·예문 / A04</w:t>
+              <w:t>같은 발췌문 15pt 세 서체·각 서체의 느낌과 형태 근거 / A04</w:t>
             </w:r>
           </w:p>
         </w:tc>
@@ -2465,7 +2465,7 @@
                 <w:color w:val="000000"/>
                 <w:sz w:val="18"/>
               </w:rPr>
-              <w:t>동일 문구 서체 비교·형태·말투·웃음·예문 / B02</w:t>
+              <w:t>같은 발췌문 15pt 세 서체·각 서체의 느낌과 형태 근거 / B02</w:t>
             </w:r>
           </w:p>
         </w:tc>
@@ -2675,7 +2675,7 @@
                 <w:color w:val="000000"/>
                 <w:sz w:val="18"/>
               </w:rPr>
-              <w:t>동일 문구 서체 비교·형태·말투·웃음·예문 / A02</w:t>
+              <w:t>같은 발췌문 15pt 세 서체·각 서체의 느낌과 형태 근거 / A02</w:t>
             </w:r>
           </w:p>
         </w:tc>
@@ -2885,7 +2885,7 @@
                 <w:color w:val="000000"/>
                 <w:sz w:val="18"/>
               </w:rPr>
-              <w:t>동일 문구 서체 비교·형태·말투·웃음·예문 / A03</w:t>
+              <w:t>같은 발췌문 15pt 세 서체·각 서체의 느낌과 형태 근거 / A03</w:t>
             </w:r>
           </w:p>
         </w:tc>
@@ -2893,7 +2893,7 @@
     </w:tbl>
     <w:p>
       <w:r>
-        <w:t>3쪽의 「알겠어」는 세 서체 모두 23pt로 보여주는 입문 지도다. 각 해설에서 두 서체를 직접 비교하고, 26쪽의 「내가 감히」는 세 서체 28pt로 읽어 감정 차이와 웃음의 이유를 다시 확인한다.</w:t>
+        <w:t>3쪽의 「알겠어」와 26쪽의 「내가 감히」는 세 서체를 16pt로 비교한다. 각 해설의 견본은 15pt이며, 크게 외치는 문구보다 서체별 인상과 그 이유를 읽는 데 집중하도록 정리했다.</w:t>
       </w:r>
     </w:p>
     <w:p>
@@ -3233,7 +3233,7 @@
                 <w:color w:val="000000"/>
                 <w:sz w:val="18"/>
               </w:rPr>
-              <w:t>동일 문구 서체 비교·형태·말투·웃음·예문 / B06</w:t>
+              <w:t>같은 발췌문 15pt 세 서체·각 서체의 느낌과 형태 근거 / B06</w:t>
             </w:r>
           </w:p>
         </w:tc>
@@ -3443,7 +3443,7 @@
                 <w:color w:val="000000"/>
                 <w:sz w:val="18"/>
               </w:rPr>
-              <w:t>동일 문구 서체 비교·형태·말투·웃음·예문 / B05</w:t>
+              <w:t>같은 발췌문 15pt 세 서체·각 서체의 느낌과 형태 근거 / B05</w:t>
             </w:r>
           </w:p>
         </w:tc>
@@ -3653,7 +3653,7 @@
                 <w:color w:val="000000"/>
                 <w:sz w:val="18"/>
               </w:rPr>
-              <w:t>동일 문구 서체 비교·형태·말투·웃음·예문 / B03</w:t>
+              <w:t>같은 발췌문 15pt 세 서체·각 서체의 느낌과 형태 근거 / B03</w:t>
             </w:r>
           </w:p>
         </w:tc>
@@ -3863,7 +3863,7 @@
                 <w:color w:val="000000"/>
                 <w:sz w:val="18"/>
               </w:rPr>
-              <w:t>동일 문구 서체 비교·형태·말투·웃음·예문 / B04</w:t>
+              <w:t>같은 발췌문 15pt 세 서체·각 서체의 느낌과 형태 근거 / B04</w:t>
             </w:r>
           </w:p>
         </w:tc>
@@ -4073,7 +4073,7 @@
                 <w:color w:val="000000"/>
                 <w:sz w:val="18"/>
               </w:rPr>
-              <w:t>동일 문구 서체 비교·형태·말투·웃음·예문 / B07</w:t>
+              <w:t>같은 발췌문 15pt 세 서체·각 서체의 느낌과 형태 근거 / B07</w:t>
             </w:r>
           </w:p>
         </w:tc>
@@ -4178,7 +4178,7 @@
                 <w:color w:val="000000"/>
                 <w:sz w:val="18"/>
               </w:rPr>
-              <w:t>내가 감히 동일 28pt 비교와 웃음의 이유 / A03</w:t>
+              <w:t>내가 감히 동일 16pt 비교와 서체별 느낌 / A03</w:t>
             </w:r>
           </w:p>
         </w:tc>
@@ -4998,7 +4998,7 @@
     </w:p>
     <w:p>
       <w:r>
-        <w:t>• 같은 문장의 서체 비교와 형태·말투·웃음의 이유를 모든 해설에 넣었다.</w:t>
+        <w:t>• 해설 제목과 견본을 줄이고, 작은 세 서체 견본 옆에 각각의 느낌과 형태적 이유를 넣었다.</w:t>
       </w:r>
     </w:p>
     <w:p>

</xml_diff>

<commit_message>
Replace crowd emoji and add six text memes within the 28-page book
</commit_message>
<xml_diff>
--- a/submission-28p/Planning_28p_GoogleDocs.docx
+++ b/submission-28p/Planning_28p_GoogleDocs.docx
@@ -22,7 +22,7 @@
     </w:p>
     <w:p>
       <w:r>
-        <w:t>책 제목은 「마참내! 폰트도 웃길 수 있다」다. 친구들과 주고받은 밈 11개를 통해 서체가 말투를 어떻게 바꾸는지 보여준다. 같은 말의 서체를 바꿔 보고, 글자 형태와 밈의 감정이 어긋나며 생기는 웃음을 살펴보는 선물책을 만든다.</w:t>
+        <w:t>책 제목은 「마참내! 폰트도 웃길 수 있다」다. 친구들과 주고받은 밈과 대사 16개를 통해 서체가 말투를 어떻게 바꾸는지 보여준다. 같은 말의 서체를 바꿔 보고, 글자 형태와 밈의 감정이 어긋나며 생기는 웃음을 살펴보는 선물책을 만든다.</w:t>
       </w:r>
     </w:p>
     <w:p>
@@ -36,7 +36,7 @@
     </w:p>
     <w:p>
       <w:r>
-        <w:t>각 서체의 형태를 관찰하고, 그 형태가 이 문맥에서 만드는 말투와 웃음의 이유를 연결한다. 예스체는 기세가 남은 반성, 고딕은 담담한 자기비하, 명조는 비장한 참회처럼 읽히는 차이를 보여준다. 견본의 크기를 줄여 세 서체와 느낌 설명을 함께 보여준다. 각 해설은 같은 발췌문을 15pt로 비교하고, 3쪽과 26쪽의 견본은 16pt로 맞춘다.</w:t>
+        <w:t>글자 형태가 이 문맥에서 만드는 말투와 웃음의 이유를 연결한다. 예스체의 기세, 고딕의 담담함, 명조의 비장함을 작은 견본과 느낌 설명으로 비교한다. 같은 지면의 견본 크기를 맞춰 서체 차이에 집중하게 하고, 눈물 독백과 결의에 찬 대사로 애틋함과 기세의 차이도 살펴본다.</w:t>
       </w:r>
     </w:p>
     <w:p>
@@ -64,12 +64,12 @@
     </w:p>
     <w:p>
       <w:r>
-        <w:t>• 왼쪽에서 밈 원문이나 문자 형상을 먼저 본다.</w:t>
+        <w:t>• 짧은 말 모음과 독백, 대사의 원문이나 문자 형상을 먼저 본다.</w:t>
       </w:r>
     </w:p>
     <w:p>
       <w:r>
-        <w:t>• 오른쪽에서 작은 견본 세 개를 비교하고 서체별 느낌과 그 이유를 읽는다.</w:t>
+        <w:t>• 같은 쪽이나 마주 보는 쪽에서 작은 세 서체 견본과 느낌의 근거를 읽는다.</w:t>
       </w:r>
     </w:p>
     <w:p>
@@ -381,7 +381,7 @@
                 <w:color w:val="000000"/>
                 <w:sz w:val="18"/>
               </w:rPr>
-              <w:t>원문 11개와 해설 11개 펼침면, 서체 지도·비교 견본·출처</w:t>
+              <w:t>16개 밈과 대사, 짧은 말 모음·1쪽 통합 지면·펼침면·서체 지도·출처</w:t>
             </w:r>
           </w:p>
         </w:tc>
@@ -523,7 +523,7 @@
         <w:pStyle w:val="Caption"/>
       </w:pPr>
       <w:r>
-        <w:t>무드보드  흰 표지와 밈 사진, 세 서체와 느낌을 비교하는 해설, 세 서체 실험실과 강조색을 묶었다. 사진의 최초 출처는 확인되지 않았다.</w:t>
+        <w:t>무드보드  흰 표지와 밈 사진, 눈물 독백 원문, 세 서체의 느낌을 비교하는 해설과 강조색을 묶었다. 사진의 최초 출처는 확인되지 않았다.</w:t>
       </w:r>
     </w:p>
     <w:p>
@@ -537,7 +537,7 @@
     </w:p>
     <w:p>
       <w:r>
-        <w:t>흰 바탕과 검정 글자로 설명을 또렷하게 하고, 빨강은 반응과 강조에 쓴다. 분홍은 과한 애정이나 감정을, 노랑은 외침과 광고 전단의 요란함을 받친다. 왼쪽의 밈 문구와 오른쪽의 작은 견본·느낌 설명을 마주 놓는다. 해설 제목은 18pt, 세 견본은 15pt로 줄이고 서체별 인상과 형태적 이유를 함께 보여준다.</w:t>
+        <w:t>흰 바탕과 검정 글자로 설명을 또렷하게 하고, 빨강은 반응과 강조에 쓴다. 분홍은 과한 애정이나 감정을, 노랑은 외침과 광고 전단의 요란함을 받친다. 긴 밈은 원문과 작은 견본·느낌 설명을 마주 놓고, 짧은 말은 한 쪽 안에서 묶는다. 펼침면 해설 제목은 18pt, 세 견본은 15pt다. 한 쪽 통합 지면은 13.5pt, 짧은 말 모음은 11pt, 입문은 16pt로 맞추고 느낌과 형태적 이유를 함께 보여준다.</w:t>
       </w:r>
     </w:p>
     <w:p>
@@ -609,7 +609,7 @@
         <w:pStyle w:val="Caption"/>
       </w:pPr>
       <w:r>
-        <w:t>「내가 감히」는 예스체의 기세, 고딕의 담담함, 명조의 비장함으로 읽힌다. 책 26쪽 견본은 모두 Regular 16pt다.</w:t>
+        <w:t>「내가 감히」는 예스체의 기세, 고딕의 담담함, 명조의 비장함으로 읽힌다. 같은 문장의 서체별 인상과 그 이유를 비교한다.</w:t>
       </w:r>
     </w:p>
     <w:tbl>
@@ -1120,7 +1120,7 @@
                 <w:color w:val="000000"/>
                 <w:sz w:val="18"/>
               </w:rPr>
-              <w:t>Noto 지원 서체와 DejaVu Sans Mono로 AA·이모지 형상을 보존한다.</w:t>
+              <w:t>Noto 지원 서체와 DejaVu Sans Mono로 문자 AA의 형상을 보존한다.</w:t>
             </w:r>
           </w:p>
         </w:tc>
@@ -1170,12 +1170,12 @@
     </w:p>
     <w:p>
       <w:r>
-        <w:t>원문 11개는 별도 TXT·JSON·Markdown으로 보관하고 해시를 기록했다. 맞춤법, 옛 유행어, 줄바꿈, 줄 끝 공백, EM SPACE·전각 공백과 이모지를 고치지 않는다. 지면의 자동 행갈이·크기·색, 새로 쓴 상황·예문·분석은 별도 편집 데이터에서 관리한다.</w:t>
+        <w:t>수집 원문 17개 중 16개를 책에 싣는다. 사람이 반복되는 이모지 밈은 지면에서 빼고 수집 기록에 남겼다. 원문은 별도 UTF-8 텍스트로 보관하고 해시를 기록한다. 눈물 독백의 분리 자모·공백·6행, 긴 로맨스 독백의 띄어쓰기와 대사의 구두점을 고치지 않는다. 지면의 크기·색과 새로 쓴 설명은 별도 편집 데이터에서 관리한다.</w:t>
       </w:r>
     </w:p>
     <w:p>
       <w:r>
-        <w:t>AA와 이모지는 지원 서체로 조판한 벡터를 사용한다. 글리프가 지원된다는 것과 원래 기기의 화면이 똑같다는 것은 다르므로, 원문과 검수 이미지를 함께 대조한다. Noto·DejaVu의 라이선스 기록을 보관하고, 예스체는 선정한 글꼴 파일을 참조하며 원본 폰트 바이너리를 재배포하지 않는다.</w:t>
+        <w:t>문자 AA는 지원 서체로 조판한 벡터를 사용한다. 글리프가 지원된다는 것과 원래 기기의 화면이 똑같다는 것은 다르므로, 원문과 검수 이미지를 함께 대조한다. Noto·DejaVu의 라이선스 기록을 보관하고, 예스체는 선정한 글꼴 파일을 참조하며 원본 폰트 바이너리를 재배포하지 않는다.</w:t>
       </w:r>
     </w:p>
     <w:p>
@@ -1194,7 +1194,7 @@
     </w:p>
     <w:p>
       <w:r>
-        <w:t>한 펼침면에서 밈 하나에 집중한다. 짝수 쪽은 원문과 형상을, 다음 홀수 쪽은 같은 발췌문을 15pt 세 서체로 보여주고, 각 서체의 느낌·형태적 이유·사용 예문을 담는다.</w:t>
+        <w:t>문구 길이에 따라 배치를 달리한다. 짧은 세 말은 2쪽에 모으고, 「내가 감히」와 로맨스 독백은 각 한 쪽에 원문과 견본을 묶는다. 긴 밈은 펼침면에서 원문과 해설을 마주 놓는다. 견본 옆에 느낌과 형태 근거, 사용 예문을 둔다.</w:t>
       </w:r>
     </w:p>
     <w:tbl>
@@ -1487,7 +1487,7 @@
                 <w:color w:val="000000"/>
                 <w:sz w:val="18"/>
               </w:rPr>
-              <w:t>이 책의 주인 + 빠른 차례</w:t>
+              <w:t>짧은 말 세 가지</w:t>
             </w:r>
           </w:p>
         </w:tc>
@@ -1520,7 +1520,7 @@
                 <w:color w:val="000000"/>
                 <w:sz w:val="18"/>
               </w:rPr>
-              <w:t>소유자 이름칸·11개 밈 차례</w:t>
+              <w:t>야르·밤티·이태민 반복 원문과 사용 예문·11pt 세 서체 / A07·A08·A09</w:t>
             </w:r>
           </w:p>
         </w:tc>
@@ -1592,7 +1592,7 @@
                 <w:color w:val="000000"/>
                 <w:sz w:val="18"/>
               </w:rPr>
-              <w:t>들어가며와 세 서체 지도</w:t>
+              <w:t>폰트별 느낌 지도</w:t>
             </w:r>
           </w:p>
         </w:tc>
@@ -1625,7 +1625,7 @@
                 <w:color w:val="000000"/>
                 <w:sz w:val="18"/>
               </w:rPr>
-              <w:t>알겠어 동일 16pt 비교와 서체별 느낌</w:t>
+              <w:t>알겠어16pt 세 서체·느낌키워드·형태 근거</w:t>
             </w:r>
           </w:p>
         </w:tc>
@@ -1730,7 +1730,7 @@
                 <w:color w:val="000000"/>
                 <w:sz w:val="18"/>
               </w:rPr>
-              <w:t>원문 전체·형상 / A01</w:t>
+              <w:t>원문 전체와 편집 캡션 / A01</w:t>
             </w:r>
           </w:p>
         </w:tc>
@@ -1835,7 +1835,7 @@
                 <w:color w:val="000000"/>
                 <w:sz w:val="18"/>
               </w:rPr>
-              <w:t>같은 발췌문 15pt 세 서체·각 서체의 느낌과 형태 근거 / A01</w:t>
+              <w:t>15pt 세 서체·느낌과 형태 근거·추천과 예문 / A01</w:t>
             </w:r>
           </w:p>
         </w:tc>
@@ -1940,7 +1940,7 @@
                 <w:color w:val="000000"/>
                 <w:sz w:val="18"/>
               </w:rPr>
-              <w:t>원문 전체·형상 / B01</w:t>
+              <w:t>원문 전체와 편집 캡션 / B01</w:t>
             </w:r>
           </w:p>
         </w:tc>
@@ -2045,7 +2045,7 @@
                 <w:color w:val="000000"/>
                 <w:sz w:val="18"/>
               </w:rPr>
-              <w:t>같은 발췌문 15pt 세 서체·각 서체의 느낌과 형태 근거 / B01</w:t>
+              <w:t>15pt 세 서체·느낌과 형태 근거·추천과 예문 / B01</w:t>
             </w:r>
           </w:p>
         </w:tc>
@@ -2150,7 +2150,7 @@
                 <w:color w:val="000000"/>
                 <w:sz w:val="18"/>
               </w:rPr>
-              <w:t>원문 전체·형상 / A04</w:t>
+              <w:t>원문 전체와 편집 캡션 / A04</w:t>
             </w:r>
           </w:p>
         </w:tc>
@@ -2255,7 +2255,7 @@
                 <w:color w:val="000000"/>
                 <w:sz w:val="18"/>
               </w:rPr>
-              <w:t>같은 발췌문 15pt 세 서체·각 서체의 느낌과 형태 근거 / A04</w:t>
+              <w:t>15pt 세 서체·느낌과 형태 근거·추천과 예문 / A04</w:t>
             </w:r>
           </w:p>
         </w:tc>
@@ -2360,7 +2360,7 @@
                 <w:color w:val="000000"/>
                 <w:sz w:val="18"/>
               </w:rPr>
-              <w:t>원문 전체·형상 / B02</w:t>
+              <w:t>원문 전체와 편집 캡션 / B02</w:t>
             </w:r>
           </w:p>
         </w:tc>
@@ -2465,7 +2465,7 @@
                 <w:color w:val="000000"/>
                 <w:sz w:val="18"/>
               </w:rPr>
-              <w:t>같은 발췌문 15pt 세 서체·각 서체의 느낌과 형태 근거 / B02</w:t>
+              <w:t>15pt 세 서체·느낌과 형태 근거·추천과 예문 / B02</w:t>
             </w:r>
           </w:p>
         </w:tc>
@@ -2570,7 +2570,7 @@
                 <w:color w:val="000000"/>
                 <w:sz w:val="18"/>
               </w:rPr>
-              <w:t>원문 전체·형상 / A02</w:t>
+              <w:t>원문 전체와 편집 캡션 / A02</w:t>
             </w:r>
           </w:p>
         </w:tc>
@@ -2675,7 +2675,7 @@
                 <w:color w:val="000000"/>
                 <w:sz w:val="18"/>
               </w:rPr>
-              <w:t>같은 발췌문 15pt 세 서체·각 서체의 느낌과 형태 근거 / A02</w:t>
+              <w:t>15pt 세 서체·느낌과 형태 근거·추천과 예문 / A02</w:t>
             </w:r>
           </w:p>
         </w:tc>
@@ -2780,7 +2780,7 @@
                 <w:color w:val="000000"/>
                 <w:sz w:val="18"/>
               </w:rPr>
-              <w:t>원문 전체·형상 / A03</w:t>
+              <w:t>원문전체·13.5pt 세 서체·느낌과 형태 근거·예문 / A03</w:t>
             </w:r>
           </w:p>
         </w:tc>
@@ -2852,7 +2852,7 @@
                 <w:color w:val="000000"/>
                 <w:sz w:val="18"/>
               </w:rPr>
-              <w:t>06. 내가 감히 — 해설</w:t>
+              <w:t>07. 로맨틱한언어들</w:t>
             </w:r>
           </w:p>
         </w:tc>
@@ -2885,7 +2885,7 @@
                 <w:color w:val="000000"/>
                 <w:sz w:val="18"/>
               </w:rPr>
-              <w:t>같은 발췌문 15pt 세 서체·각 서체의 느낌과 형태 근거 / A03</w:t>
+              <w:t>원문전체·13.5pt 세 서체·느낌과 형태 근거·예문 / A10</w:t>
             </w:r>
           </w:p>
         </w:tc>
@@ -2893,7 +2893,7 @@
     </w:tbl>
     <w:p>
       <w:r>
-        <w:t>3쪽의 「알겠어」와 26쪽의 「내가 감히」는 세 서체를 16pt로 비교한다. 각 해설의 견본은 15pt이며, 크게 외치는 문구보다 서체별 인상과 그 이유를 읽는 데 집중하도록 정리했다.</w:t>
+        <w:t>3쪽의 「알겠어」는 세 서체를 16pt로 비교한다. 펼침면은 15pt, 한 쪽 통합은 13.5pt, 짧은 말 모음은 11pt 견본으로 서체별 인상과 이유를 읽는다. 22–23쪽의 눈물 독백은 원문 자모와 공백을 살리고, 26–27쪽 대사는 같은 말에 붙는 결의와 격식을 비교한다.</w:t>
       </w:r>
     </w:p>
     <w:p>
@@ -3095,7 +3095,7 @@
                 <w:color w:val="000000"/>
                 <w:sz w:val="18"/>
               </w:rPr>
-              <w:t>07. 선배 고단수다~</w:t>
+              <w:t>08. 선배 고단수다~</w:t>
             </w:r>
           </w:p>
         </w:tc>
@@ -3128,7 +3128,7 @@
                 <w:color w:val="000000"/>
                 <w:sz w:val="18"/>
               </w:rPr>
-              <w:t>원문 전체·형상 / B06</w:t>
+              <w:t>원문 전체와 편집 캡션 / B06</w:t>
             </w:r>
           </w:p>
         </w:tc>
@@ -3200,7 +3200,7 @@
                 <w:color w:val="000000"/>
                 <w:sz w:val="18"/>
               </w:rPr>
-              <w:t>07. 선배 고단수다~ — 해설</w:t>
+              <w:t>08. 선배 고단수다~ — 해설</w:t>
             </w:r>
           </w:p>
         </w:tc>
@@ -3233,7 +3233,7 @@
                 <w:color w:val="000000"/>
                 <w:sz w:val="18"/>
               </w:rPr>
-              <w:t>같은 발췌문 15pt 세 서체·각 서체의 느낌과 형태 근거 / B06</w:t>
+              <w:t>15pt 세 서체·느낌과 형태 근거·추천과 예문 / B06</w:t>
             </w:r>
           </w:p>
         </w:tc>
@@ -3305,7 +3305,7 @@
                 <w:color w:val="000000"/>
                 <w:sz w:val="18"/>
               </w:rPr>
-              <w:t>08. 입이 쉬지를 않음</w:t>
+              <w:t>09. 입이 쉬지를 않음</w:t>
             </w:r>
           </w:p>
         </w:tc>
@@ -3338,7 +3338,7 @@
                 <w:color w:val="000000"/>
                 <w:sz w:val="18"/>
               </w:rPr>
-              <w:t>원문 전체·형상 / B05</w:t>
+              <w:t>원문 전체와 편집 캡션 / B05</w:t>
             </w:r>
           </w:p>
         </w:tc>
@@ -3410,7 +3410,7 @@
                 <w:color w:val="000000"/>
                 <w:sz w:val="18"/>
               </w:rPr>
-              <w:t>08. 입이 쉬지를 않음 — 해설</w:t>
+              <w:t>09. 입이 쉬지를 않음 — 해설</w:t>
             </w:r>
           </w:p>
         </w:tc>
@@ -3443,7 +3443,7 @@
                 <w:color w:val="000000"/>
                 <w:sz w:val="18"/>
               </w:rPr>
-              <w:t>같은 발췌문 15pt 세 서체·각 서체의 느낌과 형태 근거 / B05</w:t>
+              <w:t>15pt 세 서체·느낌과 형태 근거·추천과 예문 / B05</w:t>
             </w:r>
           </w:p>
         </w:tc>
@@ -3515,7 +3515,7 @@
                 <w:color w:val="000000"/>
                 <w:sz w:val="18"/>
               </w:rPr>
-              <w:t>09. 인정? 어 인정</w:t>
+              <w:t>10. 인정? 어 인정</w:t>
             </w:r>
           </w:p>
         </w:tc>
@@ -3548,7 +3548,7 @@
                 <w:color w:val="000000"/>
                 <w:sz w:val="18"/>
               </w:rPr>
-              <w:t>원문 전체·형상 / B03</w:t>
+              <w:t>원문 전체와 편집 캡션 / B03</w:t>
             </w:r>
           </w:p>
         </w:tc>
@@ -3620,7 +3620,7 @@
                 <w:color w:val="000000"/>
                 <w:sz w:val="18"/>
               </w:rPr>
-              <w:t>09. 인정? 어 인정 — 해설</w:t>
+              <w:t>10. 인정? 어 인정 — 해설</w:t>
             </w:r>
           </w:p>
         </w:tc>
@@ -3653,7 +3653,7 @@
                 <w:color w:val="000000"/>
                 <w:sz w:val="18"/>
               </w:rPr>
-              <w:t>같은 발췌문 15pt 세 서체·각 서체의 느낌과 형태 근거 / B03</w:t>
+              <w:t>15pt 세 서체·느낌과 형태 근거·추천과 예문 / B03</w:t>
             </w:r>
           </w:p>
         </w:tc>
@@ -3725,7 +3725,7 @@
                 <w:color w:val="000000"/>
                 <w:sz w:val="18"/>
               </w:rPr>
-              <w:t>10. 웅성웅성</w:t>
+              <w:t>11. 가끔은 눈물을 흘린다</w:t>
             </w:r>
           </w:p>
         </w:tc>
@@ -3758,7 +3758,7 @@
                 <w:color w:val="000000"/>
                 <w:sz w:val="18"/>
               </w:rPr>
-              <w:t>원문 전체·형상 / B04</w:t>
+              <w:t>원문 전체와 편집 캡션 / A05</w:t>
             </w:r>
           </w:p>
         </w:tc>
@@ -3830,7 +3830,7 @@
                 <w:color w:val="000000"/>
                 <w:sz w:val="18"/>
               </w:rPr>
-              <w:t>10. 웅성웅성 — 해설</w:t>
+              <w:t>11. 가끔은 눈물을 흘린다 — 해설</w:t>
             </w:r>
           </w:p>
         </w:tc>
@@ -3863,7 +3863,7 @@
                 <w:color w:val="000000"/>
                 <w:sz w:val="18"/>
               </w:rPr>
-              <w:t>같은 발췌문 15pt 세 서체·각 서체의 느낌과 형태 근거 / B04</w:t>
+              <w:t>15pt 세 서체·느낌과 형태 근거·추천과 예문 / A05</w:t>
             </w:r>
           </w:p>
         </w:tc>
@@ -3935,7 +3935,7 @@
                 <w:color w:val="000000"/>
                 <w:sz w:val="18"/>
               </w:rPr>
-              <w:t>11. 내일 출근 실화냐</w:t>
+              <w:t>12. 내일 출근 실화냐</w:t>
             </w:r>
           </w:p>
         </w:tc>
@@ -3968,7 +3968,7 @@
                 <w:color w:val="000000"/>
                 <w:sz w:val="18"/>
               </w:rPr>
-              <w:t>원문 전체·형상 / B07</w:t>
+              <w:t>원문 전체와 편집 캡션 / B07</w:t>
             </w:r>
           </w:p>
         </w:tc>
@@ -4040,7 +4040,7 @@
                 <w:color w:val="000000"/>
                 <w:sz w:val="18"/>
               </w:rPr>
-              <w:t>11. 내일 출근 실화냐 — 해설</w:t>
+              <w:t>12. 내일 출근 실화냐 — 해설</w:t>
             </w:r>
           </w:p>
         </w:tc>
@@ -4073,7 +4073,7 @@
                 <w:color w:val="000000"/>
                 <w:sz w:val="18"/>
               </w:rPr>
-              <w:t>같은 발췌문 15pt 세 서체·각 서체의 느낌과 형태 근거 / B07</w:t>
+              <w:t>15pt 세 서체·느낌과 형태 근거·추천과 예문 / B07</w:t>
             </w:r>
           </w:p>
         </w:tc>
@@ -4145,7 +4145,7 @@
                 <w:color w:val="000000"/>
                 <w:sz w:val="18"/>
               </w:rPr>
-              <w:t>폰트 실험실</w:t>
+              <w:t>13. 난 오늘만 산다</w:t>
             </w:r>
           </w:p>
         </w:tc>
@@ -4178,7 +4178,7 @@
                 <w:color w:val="000000"/>
                 <w:sz w:val="18"/>
               </w:rPr>
-              <w:t>내가 감히 동일 16pt 비교와 서체별 느낌 / A03</w:t>
+              <w:t>원문 전체와 편집 캡션 / A06</w:t>
             </w:r>
           </w:p>
         </w:tc>
@@ -4250,7 +4250,7 @@
                 <w:color w:val="000000"/>
                 <w:sz w:val="18"/>
               </w:rPr>
-              <w:t>에필로그 + 출처</w:t>
+              <w:t>13. 난 오늘만 산다 — 해설</w:t>
             </w:r>
           </w:p>
         </w:tc>
@@ -4283,7 +4283,7 @@
                 <w:color w:val="000000"/>
                 <w:sz w:val="18"/>
               </w:rPr>
-              <w:t>친구들에게·원문·서체·표지 사진 출처</w:t>
+              <w:t>15pt 세 서체·느낌과 형태 근거·추천과 예문 / A06</w:t>
             </w:r>
           </w:p>
         </w:tc>
@@ -4355,7 +4355,7 @@
                 <w:color w:val="000000"/>
                 <w:sz w:val="18"/>
               </w:rPr>
-              <w:t>뒷표지</w:t>
+              <w:t>뒷표지와 출처</w:t>
             </w:r>
           </w:p>
         </w:tc>
@@ -4388,7 +4388,7 @@
                 <w:color w:val="000000"/>
                 <w:sz w:val="18"/>
               </w:rPr>
-              <w:t>적절한 상황에 부적절하게 사용하십시오.</w:t>
+              <w:t>친구들에게·원문·서체·이미지 출처</w:t>
             </w:r>
           </w:p>
         </w:tc>
@@ -4400,12 +4400,12 @@
         <w:keepNext/>
       </w:pPr>
       <w:r>
-        <w:t>32쪽에서 28쪽으로 정리한 방식</w:t>
+        <w:t>16개 밈과 대사를 28쪽에 담는 방식</w:t>
       </w:r>
     </w:p>
     <w:p>
       <w:r>
-        <w:t>미수집 상태였던 12번째 밈의 빈 지면을 빼고, 차례를 2쪽으로 옮겼다. 폰트 실험실은 26쪽 한 면에 정리하고 에필로그와 출처를 27쪽에 모았다. 원문 11개와 각각의 펼침면을 유지했으며, 새 밈을 수집한 것처럼 채우거나 원문 일부를 삭제해 쪽수를 줄이지 않았다.</w:t>
+        <w:t>2쪽에 「야르」·「밤티」·「이태민이태민이태민」과 상황 예문을 모았다. 14쪽 「내가 감히」와 15쪽 로맨스 독백은 각각 한 쪽으로 묶고, 22–23쪽은 눈물 독백으로 교체했다. 26–27쪽에는 「난 오늘만 산다」를 추가하고 출처는 28쪽으로 옮겼다. 별도 실험실은 각 지면의 비교 견본으로 통합해 총 28쪽을 유지했다.</w:t>
       </w:r>
     </w:p>
     <w:p>
@@ -4419,7 +4419,7 @@
     </w:p>
     <w:p>
       <w:r>
-        <w:t>수집한 밈 원문과 선정한 표지 사진을 사용했다. 최초 게시자와 유행 시점은 확인되지 않아 추정하지 않는다. 서체 분석은 실제 서체 메타데이터와 현재 지면의 글자 형태를 관찰해 정리했다.</w:t>
+        <w:t>수집한 밈 원문과 선정한 표지 사진을 사용했다. 최초 게시자와 유행 시점, 추가 대사의 정확한 작품 출처는 확인 전까지 추정해 적지 않는다. 서체 분석은 실제 서체 메타데이터와 현재 지면의 글자 형태를 관찰해 정리했다.</w:t>
       </w:r>
     </w:p>
     <w:p>
@@ -4993,7 +4993,7 @@
     </w:p>
     <w:p>
       <w:r>
-        <w:t>• 임시 표정과 요약을 원문 11개로 교체하고 원문 저장소를 분리했다.</w:t>
+        <w:t>• 이모지 밈을 눈물 독백으로 교체하고 짧은 말·로맨스 독백·대사를 더해 16개를 수록했다.</w:t>
       </w:r>
     </w:p>
     <w:p>

</xml_diff>

<commit_message>
Remove facial emoticons and expand the book to seven actual Korean fonts
</commit_message>
<xml_diff>
--- a/submission-28p/Planning_28p_GoogleDocs.docx
+++ b/submission-28p/Planning_28p_GoogleDocs.docx
@@ -22,7 +22,7 @@
     </w:p>
     <w:p>
       <w:r>
-        <w:t>책 제목은 「마참내! 폰트도 웃길 수 있다」다. 친구들과 주고받은 밈과 대사 16개를 통해 서체가 말투를 어떻게 바꾸는지 보여준다. 같은 말의 서체를 바꿔 보고, 글자 형태와 밈의 감정이 어긋나며 생기는 웃음을 살펴보는 선물책을 만든다.</w:t>
+        <w:t>책 제목은 「마참내! 폰트도 웃길 수 있다」다. 친구들과 주고받은 밈과 대사 15개를 통해 서체가 말투를 어떻게 바꾸는지 보여주는 선물책이다. 표정 이모티콘은 지면에서 빼고, 일곱 가지 서체의 글자 형태와 문장이 만드는 웃음에 집중한다.</w:t>
       </w:r>
     </w:p>
     <w:p>
@@ -36,7 +36,7 @@
     </w:p>
     <w:p>
       <w:r>
-        <w:t>글자 형태가 이 문맥에서 만드는 말투와 웃음의 이유를 연결한다. 예스체의 기세, 고딕의 담담함, 명조의 비장함을 작은 견본과 느낌 설명으로 비교한다. 같은 지면의 견본 크기를 맞춰 서체 차이에 집중하게 하고, 눈물 독백과 결의에 찬 대사로 애틋함과 기세의 차이도 살펴본다.</w:t>
+        <w:t>같은 문장도 궁서 계열에서는 진지한 선언으로, 둥근 글씨에서는 친근한 말로, 픽셀 글씨에서는 옛 채팅창의 반응으로 읽힐 수 있다. 밈마다 어울리는 서체를 고르고 형태가 다른 세 서체를 비교해 글자가 더하는 느낌과 웃음의 이유를 보여준다.</w:t>
       </w:r>
     </w:p>
     <w:p>
@@ -50,7 +50,7 @@
     </w:p>
     <w:p>
       <w:r>
-        <w:t>핵심 독자는 평소 짤과 유행어를 주고받는 친구들이다. 전문적인 폰트 지식이 없어도 단톡방의 기세, 과한 사랑, 머쓱함, 일요일 밤의 체념을 떠올릴 수 있게 한다. 활용 예문은 친구에게 답장을 보내거나 작은 선물을 건네는 상황을 기준으로 쓴다.</w:t>
+        <w:t>핵심 독자는 평소 짤과 유행어를 주고받는 친구들이다. 전문적인 폰트 지식이 없어도 단톡방의 기세, 과한 사랑, 머쓱함, 일요일 밤의 체념을 떠올릴 수 있게 한다. 「야르」·「밤티」·「이태민」 반복은 음식 칭찬, 디자인 평가, 당첨을 바라는 실제 사용 예문과 함께 소개한다.</w:t>
       </w:r>
     </w:p>
     <w:p>
@@ -64,17 +64,17 @@
     </w:p>
     <w:p>
       <w:r>
-        <w:t>• 짧은 말 모음과 독백, 대사의 원문이나 문자 형상을 먼저 본다.</w:t>
+        <w:t>• 앞부분의 서체 도감에서 일곱 글꼴의 모양과 인상을 살펴본다.</w:t>
       </w:r>
     </w:p>
     <w:p>
       <w:r>
-        <w:t>• 같은 쪽이나 마주 보는 쪽에서 작은 세 서체 견본과 느낌의 근거를 읽는다.</w:t>
+        <w:t>• 각 밈 지면에서 텍스트와 작은 비교 견본을 읽고 느낌의 근거를 확인한다.</w:t>
       </w:r>
     </w:p>
     <w:p>
       <w:r>
-        <w:t>• 같은 감정을 느낀 날에 예문을 친구에게 보내며 다시 웃는다.</w:t>
+        <w:t>• 활용 상황이 맞는 날 예문을 친구에게 보내며 다시 웃는다.</w:t>
       </w:r>
     </w:p>
     <w:p>
@@ -381,7 +381,7 @@
                 <w:color w:val="000000"/>
                 <w:sz w:val="18"/>
               </w:rPr>
-              <w:t>16개 밈과 대사, 짧은 말 모음·1쪽 통합 지면·펼침면·서체 지도·출처</w:t>
+              <w:t>15개 밈과 대사, 일곱 서체 도감·짧은 말 모음·비교 해설·출처</w:t>
             </w:r>
           </w:p>
         </w:tc>
@@ -475,7 +475,7 @@
     </w:p>
     <w:p>
       <w:r>
-        <w:t>B급 감성이 분명히 드러나도록 콘셉트를 구체화했다. 비뚤어진 빨간 타원 도장, 낡은 웹 배너 같은 별표와 느낌표, 분홍·노랑 면, 밈의 큰 문구로 의도된 촌스러움을 만든다. 해설의 제목과 견본은 작게 정리해 서체별 느낌을 읽을 공간을 확보한다. 허술함은 새로 쓴 스티커와 캡션에서 연출하고, 원문의 철자와 공백은 그대로 보존한다.</w:t>
+        <w:t>비뚤어진 빨간 타원 도장, 낡은 웹 배너 같은 별표와 느낌표, 분홍·노랑 면으로 의도된 촌스러움을 만든다. 표정 그림이 맡았던 감정 표현은 궁서·붓글씨·둥근 글씨·픽셀 글씨의 차이로 옮긴다. 해설의 제목과 견본은 작게 정리해 서체별 느낌을 읽을 공간을 확보한다.</w:t>
       </w:r>
     </w:p>
     <w:p>
@@ -523,7 +523,7 @@
         <w:pStyle w:val="Caption"/>
       </w:pPr>
       <w:r>
-        <w:t>무드보드  흰 표지와 밈 사진, 눈물 독백 원문, 세 서체의 느낌을 비교하는 해설과 강조색을 묶었다. 사진의 최초 출처는 확인되지 않았다.</w:t>
+        <w:t>무드보드  흰 표지와 밈 사진, 서로 다른 글자 형태와 서체별 느낌을 보여주는 실제 지면을 묶었다. 사진의 최초 출처는 확인되지 않았다.</w:t>
       </w:r>
     </w:p>
     <w:p>
@@ -537,12 +537,12 @@
     </w:p>
     <w:p>
       <w:r>
-        <w:t>흰 바탕과 검정 글자로 설명을 또렷하게 하고, 빨강은 반응과 강조에 쓴다. 분홍은 과한 애정이나 감정을, 노랑은 외침과 광고 전단의 요란함을 받친다. 긴 밈은 원문과 작은 견본·느낌 설명을 마주 놓고, 짧은 말은 한 쪽 안에서 묶는다. 펼침면 해설 제목은 18pt, 세 견본은 15pt다. 한 쪽 통합 지면은 13.5pt, 짧은 말 모음은 11pt, 입문은 16pt로 맞추고 느낌과 형태적 이유를 함께 보여준다.</w:t>
+        <w:t>흰 바탕과 검정 글자로 설명을 또렷하게 하고, 빨강은 반응과 느낌 키워드에 쓴다. 분홍은 과한 애정이나 감정을, 노랑은 외침과 광고 전단의 요란함을 받친다. 긴 밈은 텍스트와 해설을 마주 놓고, 짧은 말은 한 쪽 안에서 비교한다.</w:t>
       </w:r>
     </w:p>
     <w:p>
       <w:r>
-        <w:t>표지는 흰 배경에 ‘무섭다’ 사진을 크게 놓고 검정 예스체 제목을 더한다. 사진 속 빨간 말풍선이 강조색의 기준이 된다. 해설 쪽은 같은 발췌문을 예스체·고딕·명조로 나란히 읽고, 각 서체가 주는 느낌과 그 느낌이 생기는 획의 특징을 바로 확인하게 한다.</w:t>
+        <w:t>표지는 흰 배경에 ‘무섭다’ 사진을 크게 놓고 검정 예스체 제목을 더한다. 사진 속 빨간 말풍선이 강조색의 기준이 된다. 본문은 일곱 서체를 모두 같은 횟수로 쓰기보다 각 밈의 말투에 맞춰 선택한다. 비교 견본은 문구·크기·색을 맞춰 글자 형태의 차이가 보이게 한다.</w:t>
       </w:r>
     </w:p>
     <w:p>
@@ -556,60 +556,12 @@
         <w:keepNext/>
       </w:pPr>
       <w:r>
-        <w:t>세 서체의 형태와 말투 비교</w:t>
+        <w:t>일곱 서체의 형태와 말투</w:t>
       </w:r>
     </w:p>
     <w:p>
       <w:r>
-        <w:t>예스체를 표지와 해설의 기준으로 삼고 Noto 고딕·명조를 비교한다. 아래 인상은 이 책의 문구에서 읽히는 해석이며, 서체의 고정된 성격은 아니다. Regular끼리도 실제 획의 무게는 다르다. 예스체에 없는 Bold는 합성하지 않는다.</w:t>
-      </w:r>
-    </w:p>
-    <w:p>
-      <w:pPr>
-        <w:spacing w:after="100"/>
-        <w:jc w:val="center"/>
-      </w:pPr>
-      <w:r>
-        <w:drawing>
-          <wp:inline xmlns:a="http://schemas.openxmlformats.org/drawingml/2006/main" xmlns:pic="http://schemas.openxmlformats.org/drawingml/2006/picture">
-            <wp:extent cx="6120000" cy="1311429"/>
-            <wp:docPr id="2" name="Picture 2"/>
-            <wp:cNvGraphicFramePr>
-              <a:graphicFrameLocks noChangeAspect="1"/>
-            </wp:cNvGraphicFramePr>
-            <a:graphic>
-              <a:graphicData uri="http://schemas.openxmlformats.org/drawingml/2006/picture">
-                <pic:pic>
-                  <pic:nvPicPr>
-                    <pic:cNvPr id="0" name="font_comparison.png"/>
-                    <pic:cNvPicPr/>
-                  </pic:nvPicPr>
-                  <pic:blipFill>
-                    <a:blip r:embed="rId12"/>
-                    <a:stretch>
-                      <a:fillRect/>
-                    </a:stretch>
-                  </pic:blipFill>
-                  <pic:spPr>
-                    <a:xfrm>
-                      <a:off x="0" y="0"/>
-                      <a:ext cx="6120000" cy="1311429"/>
-                    </a:xfrm>
-                    <a:prstGeom prst="rect"/>
-                  </pic:spPr>
-                </pic:pic>
-              </a:graphicData>
-            </a:graphic>
-          </wp:inline>
-        </w:drawing>
-      </w:r>
-    </w:p>
-    <w:p>
-      <w:pPr>
-        <w:pStyle w:val="Caption"/>
-      </w:pPr>
-      <w:r>
-        <w:t>「내가 감히」는 예스체의 기세, 고딕의 담담함, 명조의 비장함으로 읽힌다. 같은 문장의 서체별 인상과 그 이유를 비교한다.</w:t>
+        <w:t>예스체를 책의 기본 목소리로 두고, 고딕·명조·궁서 계열·붓글씨·둥근 글씨·픽셀 글씨를 실제 적용한다. 아래 느낌은 이 책의 문구와 배치에 대한 해석이다. 크기와 간격을 바꾸면 같은 서체도 다르게 읽힌다.</w:t>
       </w:r>
     </w:p>
     <w:tbl>
@@ -621,8 +573,8 @@
       </w:tblPr>
       <w:tblGrid>
         <w:gridCol w:w="2438"/>
-        <w:gridCol w:w="3685"/>
-        <w:gridCol w:w="3628"/>
+        <w:gridCol w:w="3288"/>
+        <w:gridCol w:w="4025"/>
       </w:tblGrid>
       <w:tr>
         <w:trPr>
@@ -659,13 +611,13 @@
                 <w:color w:val="FFFFFF"/>
                 <w:sz w:val="18"/>
               </w:rPr>
-              <w:t>서체</w:t>
+              <w:t>실제 적용 서체</w:t>
             </w:r>
           </w:p>
         </w:tc>
         <w:tc>
           <w:tcPr>
-            <w:tcW w:type="dxa" w:w="3685"/>
+            <w:tcW w:type="dxa" w:w="3288"/>
             <w:vAlign w:val="center"/>
             <w:tcBorders>
               <w:top w:val="single" w:sz="4" w:color="D9D9D9"/>
@@ -692,13 +644,13 @@
                 <w:color w:val="FFFFFF"/>
                 <w:sz w:val="18"/>
               </w:rPr>
-              <w:t>형태에서 읽히는 말투</w:t>
+              <w:t>눈에 보이는 특징</w:t>
             </w:r>
           </w:p>
         </w:tc>
         <w:tc>
           <w:tcPr>
-            <w:tcW w:type="dxa" w:w="3628"/>
+            <w:tcW w:type="dxa" w:w="4025"/>
             <w:vAlign w:val="center"/>
             <w:tcBorders>
               <w:top w:val="single" w:sz="4" w:color="D9D9D9"/>
@@ -725,7 +677,7 @@
                 <w:color w:val="FFFFFF"/>
                 <w:sz w:val="18"/>
               </w:rPr>
-              <w:t>이 문구에서 웃기는 이유</w:t>
+              <w:t>이 책에서 읽히는 느낌</w:t>
             </w:r>
           </w:p>
         </w:tc>
@@ -765,14 +717,12 @@
                 <w:sz w:val="18"/>
               </w:rPr>
               <w:t>예스체 YES24</w:t>
-              <w:br/>
-              <w:t>Regular</w:t>
             </w:r>
           </w:p>
         </w:tc>
         <w:tc>
           <w:tcPr>
-            <w:tcW w:type="dxa" w:w="3685"/>
+            <w:tcW w:type="dxa" w:w="3288"/>
             <w:vAlign w:val="center"/>
             <w:tcBorders>
               <w:top w:val="single" w:sz="4" w:color="D9D9D9"/>
@@ -799,13 +749,13 @@
                 <w:color w:val="000000"/>
                 <w:sz w:val="18"/>
               </w:rPr>
-              <w:t>짙은 획과 직선 골격이 단호한 말투를 만든다.</w:t>
+              <w:t>짙은 획과 직선 골격</w:t>
             </w:r>
           </w:p>
         </w:tc>
         <w:tc>
           <w:tcPr>
-            <w:tcW w:type="dxa" w:w="3628"/>
+            <w:tcW w:type="dxa" w:w="4025"/>
             <w:vAlign w:val="center"/>
             <w:tcBorders>
               <w:top w:val="single" w:sz="4" w:color="D9D9D9"/>
@@ -832,7 +782,7 @@
                 <w:color w:val="000000"/>
                 <w:sz w:val="18"/>
               </w:rPr>
-              <w:t>반성하는 말인데 항의문처럼 힘이 남아 머쓱해진다.</w:t>
+              <w:t>단호함과 자신감. 작은 말도 크게 외친다.</w:t>
             </w:r>
           </w:p>
         </w:tc>
@@ -872,14 +822,12 @@
                 <w:sz w:val="18"/>
               </w:rPr>
               <w:t>Noto Sans CJK KR</w:t>
-              <w:br/>
-              <w:t>Regular</w:t>
             </w:r>
           </w:p>
         </w:tc>
         <w:tc>
           <w:tcPr>
-            <w:tcW w:type="dxa" w:w="3685"/>
+            <w:tcW w:type="dxa" w:w="3288"/>
             <w:vAlign w:val="center"/>
             <w:tcBorders>
               <w:top w:val="single" w:sz="4" w:color="D9D9D9"/>
@@ -906,13 +854,13 @@
                 <w:color w:val="000000"/>
                 <w:sz w:val="18"/>
               </w:rPr>
-              <w:t>획 굵기 차이가 작고 끝 장식이 적어 담담하게 읽힌다.</w:t>
+              <w:t>고른 획과 절제된 끝맺음</w:t>
             </w:r>
           </w:p>
         </w:tc>
         <w:tc>
           <w:tcPr>
-            <w:tcW w:type="dxa" w:w="3628"/>
+            <w:tcW w:type="dxa" w:w="4025"/>
             <w:vAlign w:val="center"/>
             <w:tcBorders>
               <w:top w:val="single" w:sz="4" w:color="D9D9D9"/>
@@ -939,7 +887,7 @@
                 <w:color w:val="000000"/>
                 <w:sz w:val="18"/>
               </w:rPr>
-              <w:t>과한 자기비하를 공지문처럼 차분히 말하는 온도 차이가 난다.</w:t>
+              <w:t>담담함과 거리감. 과한 말도 사실처럼 읽힌다.</w:t>
             </w:r>
           </w:p>
         </w:tc>
@@ -979,14 +927,12 @@
                 <w:sz w:val="18"/>
               </w:rPr>
               <w:t>Noto Serif CJK KR</w:t>
-              <w:br/>
-              <w:t>Regular</w:t>
             </w:r>
           </w:p>
         </w:tc>
         <w:tc>
           <w:tcPr>
-            <w:tcW w:type="dxa" w:w="3685"/>
+            <w:tcW w:type="dxa" w:w="3288"/>
             <w:vAlign w:val="center"/>
             <w:tcBorders>
               <w:top w:val="single" w:sz="4" w:color="D9D9D9"/>
@@ -1013,13 +959,13 @@
                 <w:color w:val="000000"/>
                 <w:sz w:val="18"/>
               </w:rPr>
-              <w:t>굵기 대비와 끝 장식이 격식을 더한다.</w:t>
+              <w:t>획의 굵기 대비와 끝 장식</w:t>
             </w:r>
           </w:p>
         </w:tc>
         <w:tc>
           <w:tcPr>
-            <w:tcW w:type="dxa" w:w="3628"/>
+            <w:tcW w:type="dxa" w:w="4025"/>
             <w:vAlign w:val="center"/>
             <w:tcBorders>
               <w:top w:val="single" w:sz="4" w:color="D9D9D9"/>
@@ -1046,7 +992,7 @@
                 <w:color w:val="000000"/>
                 <w:sz w:val="18"/>
               </w:rPr>
-              <w:t>사소한 머쓱함을 장편 참회처럼 대하는 과장이 생긴다.</w:t>
+              <w:t>애틋함과 격식. 사소한 감정도 공들인 고백이 된다.</w:t>
             </w:r>
           </w:p>
         </w:tc>
@@ -1085,15 +1031,13 @@
                 <w:color w:val="000000"/>
                 <w:sz w:val="18"/>
               </w:rPr>
-              <w:t>특수 문자</w:t>
-              <w:br/>
-              <w:t>지원 서체</w:t>
+              <w:t>은궁서</w:t>
             </w:r>
           </w:p>
         </w:tc>
         <w:tc>
           <w:tcPr>
-            <w:tcW w:type="dxa" w:w="3685"/>
+            <w:tcW w:type="dxa" w:w="3288"/>
             <w:vAlign w:val="center"/>
             <w:tcBorders>
               <w:top w:val="single" w:sz="4" w:color="D9D9D9"/>
@@ -1120,13 +1064,13 @@
                 <w:color w:val="000000"/>
                 <w:sz w:val="18"/>
               </w:rPr>
-              <w:t>Noto 지원 서체와 DejaVu Sans Mono로 문자 AA의 형상을 보존한다.</w:t>
+              <w:t>궁서 계열의 붓획과 무게 있는 끝맺음</w:t>
             </w:r>
           </w:p>
         </w:tc>
         <w:tc>
           <w:tcPr>
-            <w:tcW w:type="dxa" w:w="3628"/>
+            <w:tcW w:type="dxa" w:w="4025"/>
             <w:vAlign w:val="center"/>
             <w:tcBorders>
               <w:top w:val="single" w:sz="4" w:color="D9D9D9"/>
@@ -1153,7 +1097,322 @@
                 <w:color w:val="000000"/>
                 <w:sz w:val="18"/>
               </w:rPr>
-              <w:t>AA의 표정과 해설의 말투를 구분한다.</w:t>
+              <w:t>엄숙함과 결의. 짧은 반응도 진지한 선언이 된다.</w:t>
+            </w:r>
+          </w:p>
+        </w:tc>
+      </w:tr>
+      <w:tr>
+        <w:trPr>
+          <w:cantSplit/>
+        </w:trPr>
+        <w:tc>
+          <w:tcPr>
+            <w:tcW w:type="dxa" w:w="2438"/>
+            <w:vAlign w:val="center"/>
+            <w:tcBorders>
+              <w:top w:val="single" w:sz="4" w:color="D9D9D9"/>
+              <w:left w:val="single" w:sz="4" w:color="D9D9D9"/>
+              <w:bottom w:val="single" w:sz="4" w:color="D9D9D9"/>
+              <w:right w:val="single" w:sz="4" w:color="D9D9D9"/>
+            </w:tcBorders>
+            <w:tcMar>
+              <w:top w:w="70" w:type="dxa"/>
+              <w:bottom w:w="70" w:type="dxa"/>
+              <w:left w:w="95" w:type="dxa"/>
+              <w:right w:w="95" w:type="dxa"/>
+            </w:tcMar>
+            <w:shd w:fill="FFFFFF"/>
+          </w:tcPr>
+          <w:p>
+            <w:pPr>
+              <w:spacing w:after="20" w:before="20" w:line="271" w:lineRule="auto"/>
+              <w:jc w:val="center"/>
+            </w:pPr>
+            <w:r>
+              <w:rPr>
+                <w:rFonts w:ascii="Noto Sans CJK KR" w:hAnsi="Noto Sans CJK KR" w:eastAsia="Noto Sans CJK KR"/>
+                <w:b w:val="0"/>
+                <w:color w:val="000000"/>
+                <w:sz w:val="18"/>
+              </w:rPr>
+              <w:t>주아 (Jua)</w:t>
+            </w:r>
+          </w:p>
+        </w:tc>
+        <w:tc>
+          <w:tcPr>
+            <w:tcW w:type="dxa" w:w="3288"/>
+            <w:vAlign w:val="center"/>
+            <w:tcBorders>
+              <w:top w:val="single" w:sz="4" w:color="D9D9D9"/>
+              <w:left w:val="single" w:sz="4" w:color="D9D9D9"/>
+              <w:bottom w:val="single" w:sz="4" w:color="D9D9D9"/>
+              <w:right w:val="single" w:sz="4" w:color="D9D9D9"/>
+            </w:tcBorders>
+            <w:tcMar>
+              <w:top w:w="70" w:type="dxa"/>
+              <w:bottom w:w="70" w:type="dxa"/>
+              <w:left w:w="95" w:type="dxa"/>
+              <w:right w:w="95" w:type="dxa"/>
+            </w:tcMar>
+            <w:shd w:fill="FFFFFF"/>
+          </w:tcPr>
+          <w:p>
+            <w:pPr>
+              <w:spacing w:after="20" w:before="20" w:line="271" w:lineRule="auto"/>
+            </w:pPr>
+            <w:r>
+              <w:rPr>
+                <w:rFonts w:ascii="Noto Sans CJK KR" w:hAnsi="Noto Sans CJK KR" w:eastAsia="Noto Sans CJK KR"/>
+                <w:b w:val="0"/>
+                <w:color w:val="000000"/>
+                <w:sz w:val="18"/>
+              </w:rPr>
+              <w:t>둥글고 도톰한 글자 형태</w:t>
+            </w:r>
+          </w:p>
+        </w:tc>
+        <w:tc>
+          <w:tcPr>
+            <w:tcW w:type="dxa" w:w="4025"/>
+            <w:vAlign w:val="center"/>
+            <w:tcBorders>
+              <w:top w:val="single" w:sz="4" w:color="D9D9D9"/>
+              <w:left w:val="single" w:sz="4" w:color="D9D9D9"/>
+              <w:bottom w:val="single" w:sz="4" w:color="D9D9D9"/>
+              <w:right w:val="single" w:sz="4" w:color="D9D9D9"/>
+            </w:tcBorders>
+            <w:tcMar>
+              <w:top w:w="70" w:type="dxa"/>
+              <w:bottom w:w="70" w:type="dxa"/>
+              <w:left w:w="95" w:type="dxa"/>
+              <w:right w:w="95" w:type="dxa"/>
+            </w:tcMar>
+            <w:shd w:fill="FFFFFF"/>
+          </w:tcPr>
+          <w:p>
+            <w:pPr>
+              <w:spacing w:after="20" w:before="20" w:line="271" w:lineRule="auto"/>
+            </w:pPr>
+            <w:r>
+              <w:rPr>
+                <w:rFonts w:ascii="Noto Sans CJK KR" w:hAnsi="Noto Sans CJK KR" w:eastAsia="Noto Sans CJK KR"/>
+                <w:b w:val="0"/>
+                <w:color w:val="000000"/>
+                <w:sz w:val="18"/>
+              </w:rPr>
+              <w:t>친근함과 장난기. 강한 말도 부드럽게 전한다.</w:t>
+            </w:r>
+          </w:p>
+        </w:tc>
+      </w:tr>
+      <w:tr>
+        <w:trPr>
+          <w:cantSplit/>
+        </w:trPr>
+        <w:tc>
+          <w:tcPr>
+            <w:tcW w:type="dxa" w:w="2438"/>
+            <w:vAlign w:val="center"/>
+            <w:tcBorders>
+              <w:top w:val="single" w:sz="4" w:color="D9D9D9"/>
+              <w:left w:val="single" w:sz="4" w:color="D9D9D9"/>
+              <w:bottom w:val="single" w:sz="4" w:color="D9D9D9"/>
+              <w:right w:val="single" w:sz="4" w:color="D9D9D9"/>
+            </w:tcBorders>
+            <w:tcMar>
+              <w:top w:w="70" w:type="dxa"/>
+              <w:bottom w:w="70" w:type="dxa"/>
+              <w:left w:w="95" w:type="dxa"/>
+              <w:right w:w="95" w:type="dxa"/>
+            </w:tcMar>
+            <w:shd w:fill="F6F6F6"/>
+          </w:tcPr>
+          <w:p>
+            <w:pPr>
+              <w:spacing w:after="20" w:before="20" w:line="271" w:lineRule="auto"/>
+              <w:jc w:val="center"/>
+            </w:pPr>
+            <w:r>
+              <w:rPr>
+                <w:rFonts w:ascii="Noto Sans CJK KR" w:hAnsi="Noto Sans CJK KR" w:eastAsia="Noto Sans CJK KR"/>
+                <w:b w:val="0"/>
+                <w:color w:val="000000"/>
+                <w:sz w:val="18"/>
+              </w:rPr>
+              <w:t>나눔손글씨 붓</w:t>
+            </w:r>
+          </w:p>
+        </w:tc>
+        <w:tc>
+          <w:tcPr>
+            <w:tcW w:type="dxa" w:w="3288"/>
+            <w:vAlign w:val="center"/>
+            <w:tcBorders>
+              <w:top w:val="single" w:sz="4" w:color="D9D9D9"/>
+              <w:left w:val="single" w:sz="4" w:color="D9D9D9"/>
+              <w:bottom w:val="single" w:sz="4" w:color="D9D9D9"/>
+              <w:right w:val="single" w:sz="4" w:color="D9D9D9"/>
+            </w:tcBorders>
+            <w:tcMar>
+              <w:top w:w="70" w:type="dxa"/>
+              <w:bottom w:w="70" w:type="dxa"/>
+              <w:left w:w="95" w:type="dxa"/>
+              <w:right w:w="95" w:type="dxa"/>
+            </w:tcMar>
+            <w:shd w:fill="F6F6F6"/>
+          </w:tcPr>
+          <w:p>
+            <w:pPr>
+              <w:spacing w:after="20" w:before="20" w:line="271" w:lineRule="auto"/>
+            </w:pPr>
+            <w:r>
+              <w:rPr>
+                <w:rFonts w:ascii="Noto Sans CJK KR" w:hAnsi="Noto Sans CJK KR" w:eastAsia="Noto Sans CJK KR"/>
+                <w:b w:val="0"/>
+                <w:color w:val="000000"/>
+                <w:sz w:val="18"/>
+              </w:rPr>
+              <w:t>붓으로 쓴 듯한 획과 손글씨 리듬</w:t>
+            </w:r>
+          </w:p>
+        </w:tc>
+        <w:tc>
+          <w:tcPr>
+            <w:tcW w:type="dxa" w:w="4025"/>
+            <w:vAlign w:val="center"/>
+            <w:tcBorders>
+              <w:top w:val="single" w:sz="4" w:color="D9D9D9"/>
+              <w:left w:val="single" w:sz="4" w:color="D9D9D9"/>
+              <w:bottom w:val="single" w:sz="4" w:color="D9D9D9"/>
+              <w:right w:val="single" w:sz="4" w:color="D9D9D9"/>
+            </w:tcBorders>
+            <w:tcMar>
+              <w:top w:w="70" w:type="dxa"/>
+              <w:bottom w:w="70" w:type="dxa"/>
+              <w:left w:w="95" w:type="dxa"/>
+              <w:right w:w="95" w:type="dxa"/>
+            </w:tcMar>
+            <w:shd w:fill="F6F6F6"/>
+          </w:tcPr>
+          <w:p>
+            <w:pPr>
+              <w:spacing w:after="20" w:before="20" w:line="271" w:lineRule="auto"/>
+            </w:pPr>
+            <w:r>
+              <w:rPr>
+                <w:rFonts w:ascii="Noto Sans CJK KR" w:hAnsi="Noto Sans CJK KR" w:eastAsia="Noto Sans CJK KR"/>
+                <w:b w:val="0"/>
+                <w:color w:val="000000"/>
+                <w:sz w:val="18"/>
+              </w:rPr>
+              <w:t>솔직함과 감정의 흔적. 고백에 사람의 온도를 더한다.</w:t>
+            </w:r>
+          </w:p>
+        </w:tc>
+      </w:tr>
+      <w:tr>
+        <w:trPr>
+          <w:cantSplit/>
+        </w:trPr>
+        <w:tc>
+          <w:tcPr>
+            <w:tcW w:type="dxa" w:w="2438"/>
+            <w:vAlign w:val="center"/>
+            <w:tcBorders>
+              <w:top w:val="single" w:sz="4" w:color="D9D9D9"/>
+              <w:left w:val="single" w:sz="4" w:color="D9D9D9"/>
+              <w:bottom w:val="single" w:sz="4" w:color="D9D9D9"/>
+              <w:right w:val="single" w:sz="4" w:color="D9D9D9"/>
+            </w:tcBorders>
+            <w:tcMar>
+              <w:top w:w="70" w:type="dxa"/>
+              <w:bottom w:w="70" w:type="dxa"/>
+              <w:left w:w="95" w:type="dxa"/>
+              <w:right w:w="95" w:type="dxa"/>
+            </w:tcMar>
+            <w:shd w:fill="FFFFFF"/>
+          </w:tcPr>
+          <w:p>
+            <w:pPr>
+              <w:spacing w:after="20" w:before="20" w:line="271" w:lineRule="auto"/>
+              <w:jc w:val="center"/>
+            </w:pPr>
+            <w:r>
+              <w:rPr>
+                <w:rFonts w:ascii="Noto Sans CJK KR" w:hAnsi="Noto Sans CJK KR" w:eastAsia="Noto Sans CJK KR"/>
+                <w:b w:val="0"/>
+                <w:color w:val="000000"/>
+                <w:sz w:val="18"/>
+              </w:rPr>
+              <w:t>둥근모꼴</w:t>
+            </w:r>
+          </w:p>
+        </w:tc>
+        <w:tc>
+          <w:tcPr>
+            <w:tcW w:type="dxa" w:w="3288"/>
+            <w:vAlign w:val="center"/>
+            <w:tcBorders>
+              <w:top w:val="single" w:sz="4" w:color="D9D9D9"/>
+              <w:left w:val="single" w:sz="4" w:color="D9D9D9"/>
+              <w:bottom w:val="single" w:sz="4" w:color="D9D9D9"/>
+              <w:right w:val="single" w:sz="4" w:color="D9D9D9"/>
+            </w:tcBorders>
+            <w:tcMar>
+              <w:top w:w="70" w:type="dxa"/>
+              <w:bottom w:w="70" w:type="dxa"/>
+              <w:left w:w="95" w:type="dxa"/>
+              <w:right w:w="95" w:type="dxa"/>
+            </w:tcMar>
+            <w:shd w:fill="FFFFFF"/>
+          </w:tcPr>
+          <w:p>
+            <w:pPr>
+              <w:spacing w:after="20" w:before="20" w:line="271" w:lineRule="auto"/>
+            </w:pPr>
+            <w:r>
+              <w:rPr>
+                <w:rFonts w:ascii="Noto Sans CJK KR" w:hAnsi="Noto Sans CJK KR" w:eastAsia="Noto Sans CJK KR"/>
+                <w:b w:val="0"/>
+                <w:color w:val="000000"/>
+                <w:sz w:val="18"/>
+              </w:rPr>
+              <w:t>격자 위에서 꺾이는 픽셀 형태</w:t>
+            </w:r>
+          </w:p>
+        </w:tc>
+        <w:tc>
+          <w:tcPr>
+            <w:tcW w:type="dxa" w:w="4025"/>
+            <w:vAlign w:val="center"/>
+            <w:tcBorders>
+              <w:top w:val="single" w:sz="4" w:color="D9D9D9"/>
+              <w:left w:val="single" w:sz="4" w:color="D9D9D9"/>
+              <w:bottom w:val="single" w:sz="4" w:color="D9D9D9"/>
+              <w:right w:val="single" w:sz="4" w:color="D9D9D9"/>
+            </w:tcBorders>
+            <w:tcMar>
+              <w:top w:w="70" w:type="dxa"/>
+              <w:bottom w:w="70" w:type="dxa"/>
+              <w:left w:w="95" w:type="dxa"/>
+              <w:right w:w="95" w:type="dxa"/>
+            </w:tcMar>
+            <w:shd w:fill="FFFFFF"/>
+          </w:tcPr>
+          <w:p>
+            <w:pPr>
+              <w:spacing w:after="20" w:before="20" w:line="271" w:lineRule="auto"/>
+            </w:pPr>
+            <w:r>
+              <w:rPr>
+                <w:rFonts w:ascii="Noto Sans CJK KR" w:hAnsi="Noto Sans CJK KR" w:eastAsia="Noto Sans CJK KR"/>
+                <w:b w:val="0"/>
+                <w:color w:val="000000"/>
+                <w:sz w:val="18"/>
+              </w:rPr>
+              <w:t>옛 채팅창의 유쾌함. 전단의 과장과 어울린다.</w:t>
             </w:r>
           </w:p>
         </w:tc>
@@ -1165,17 +1424,112 @@
         <w:keepNext/>
       </w:pPr>
       <w:r>
-        <w:t>원문과 편집 원고를 나누는 이유</w:t>
+        <w:t>서체명과 사용 범위</w:t>
       </w:r>
     </w:p>
     <w:p>
       <w:r>
-        <w:t>수집 원문 17개 중 16개를 책에 싣는다. 사람이 반복되는 이모지 밈은 지면에서 빼고 수집 기록에 남겼다. 원문은 별도 UTF-8 텍스트로 보관하고 해시를 기록한다. 눈물 독백의 분리 자모·공백·6행, 긴 로맨스 독백의 띄어쓰기와 대사의 구두점을 고치지 않는다. 지면의 크기·색과 새로 쓴 설명은 별도 편집 데이터에서 관리한다.</w:t>
+        <w:t>궁서 계열은 실제 적용한 은궁서로 표기하고 원형 둥근모꼴도 다른 픽셀 서체와 구별한다. 이름이 비슷하더라도 서로 다른 서체를 같은 글꼴로 소개하지 않는다. 동일한 굵기 이름이 실제 획 두께까지 같다는 뜻은 아니며, 없는 굵기를 합성해 만들지 않는다.</w:t>
       </w:r>
     </w:p>
     <w:p>
       <w:r>
-        <w:t>문자 AA는 지원 서체로 조판한 벡터를 사용한다. 글리프가 지원된다는 것과 원래 기기의 화면이 똑같다는 것은 다르므로, 원문과 검수 이미지를 함께 대조한다. Noto·DejaVu의 라이선스 기록을 보관하고, 예스체는 선정한 글꼴 파일을 참조하며 원본 폰트 바이너리를 재배포하지 않는다.</w:t>
+        <w:t>동일한 포인트로 맞춰도 실제 글자 높이와 검은 면적은 다를 수 있다. 비교 견본은 같은 포인트로 두고, 붓글씨처럼 작게 보이는 서체의 긴 본문은 읽기 쉽도록 별도로 조정한다.</w:t>
+      </w:r>
+    </w:p>
+    <w:p>
+      <w:r>
+        <w:t>배포 조건을 확인한 글꼴을 사용하고 라이선스 기록을 보관한다. 기획안과 PDF에는 실제 글자 형태를 보여주되, 선정한 폰트의 원본 바이너리를 일괄 동봉하지 않는다. 편집 시 필요한 실제 서체명은 서체 도감과 편집 파일의 안내에 맞춘다.</w:t>
+      </w:r>
+    </w:p>
+    <w:p>
+      <w:r>
+        <w:br w:type="page"/>
+      </w:r>
+    </w:p>
+    <w:p>
+      <w:pPr>
+        <w:pStyle w:val="Heading1"/>
+        <w:keepNext/>
+      </w:pPr>
+      <w:r>
+        <w:t>서체 도감과 텍스트 편집 원칙</w:t>
+      </w:r>
+    </w:p>
+    <w:p>
+      <w:pPr>
+        <w:spacing w:after="100"/>
+        <w:jc w:val="center"/>
+      </w:pPr>
+      <w:r>
+        <w:drawing>
+          <wp:inline xmlns:a="http://schemas.openxmlformats.org/drawingml/2006/main" xmlns:pic="http://schemas.openxmlformats.org/drawingml/2006/picture">
+            <wp:extent cx="5580000" cy="3957245"/>
+            <wp:docPr id="2" name="Picture 2"/>
+            <wp:cNvGraphicFramePr>
+              <a:graphicFrameLocks noChangeAspect="1"/>
+            </wp:cNvGraphicFramePr>
+            <a:graphic>
+              <a:graphicData uri="http://schemas.openxmlformats.org/drawingml/2006/picture">
+                <pic:pic>
+                  <pic:nvPicPr>
+                    <pic:cNvPr id="0" name="spread_04_05.jpg"/>
+                    <pic:cNvPicPr/>
+                  </pic:nvPicPr>
+                  <pic:blipFill>
+                    <a:blip r:embed="rId12"/>
+                    <a:stretch>
+                      <a:fillRect/>
+                    </a:stretch>
+                  </pic:blipFill>
+                  <pic:spPr>
+                    <a:xfrm>
+                      <a:off x="0" y="0"/>
+                      <a:ext cx="5580000" cy="3957245"/>
+                    </a:xfrm>
+                    <a:prstGeom prst="rect"/>
+                  </pic:spPr>
+                </pic:pic>
+              </a:graphicData>
+            </a:graphic>
+          </wp:inline>
+        </w:drawing>
+      </w:r>
+    </w:p>
+    <w:p>
+      <w:pPr>
+        <w:pStyle w:val="Caption"/>
+      </w:pPr>
+      <w:r>
+        <w:t>책 4–5쪽의 서체 도감. 같은 문장을 서로 다른 글꼴로 놓고, 획과 장식에서 읽히는 느낌을 함께 설명한다.</w:t>
+      </w:r>
+    </w:p>
+    <w:p>
+      <w:pPr>
+        <w:pStyle w:val="Heading2"/>
+        <w:keepNext/>
+      </w:pPr>
+      <w:r>
+        <w:t>표정 요소를 지면에서 제외하는 방식</w:t>
+      </w:r>
+    </w:p>
+    <w:p>
+      <w:r>
+        <w:t>AA 얼굴만으로 구성된 밈은 책에서 제외한다. 「카쟈」는 뒤의 문자 표정을 빼고 말만 발췌하며, 긴 칭찬 밈은 따봉 그림과 복합 얼굴을 제외한 텍스트를 사용한다. 눈물 독백에서도 표정 기호는 지면에서 제외한다. 발췌·편집 지면이라는 사실을 구분하고 보관 원문은 고치지 않는다.</w:t>
+      </w:r>
+    </w:p>
+    <w:p>
+      <w:pPr>
+        <w:pStyle w:val="Heading2"/>
+        <w:keepNext/>
+      </w:pPr>
+      <w:r>
+        <w:t>원문과 편집 원고의 구분</w:t>
+      </w:r>
+    </w:p>
+    <w:p>
+      <w:r>
+        <w:t>수집 텍스트 17개는 공백·자모·구두점·줄끝 공백까지 별도 보존하고 그중 15개의 밈을 책에 선정했다. 눈물 독백의 끊어진 자모와 로맨스 독백의 붙여쓰기는 표현의 일부로 다룬다. 지면의 발췌, 표정 기호 제외, 크기·색과 새로 쓴 설명은 원문과 별도 필드에서 관리한다.</w:t>
       </w:r>
     </w:p>
     <w:p>
@@ -1194,7 +1548,7 @@
     </w:p>
     <w:p>
       <w:r>
-        <w:t>문구 길이에 따라 배치를 달리한다. 짧은 세 말은 2쪽에 모으고, 「내가 감히」와 로맨스 독백은 각 한 쪽에 원문과 견본을 묶는다. 긴 밈은 펼침면에서 원문과 해설을 마주 놓는다. 견본 옆에 느낌과 형태 근거, 사용 예문을 둔다.</w:t>
+        <w:t>2쪽은 짧은 말 세 가지, 3쪽은 읽는 방법, 4–5쪽은 실제 서체 도감으로 구성한다. 뒤의 밈 지면에서는 일곱 서체 중 말투 차이가 잘 드러나는 세 가지를 골라 비교한다.</w:t>
       </w:r>
     </w:p>
     <w:tbl>
@@ -1625,7 +1979,7 @@
                 <w:color w:val="000000"/>
                 <w:sz w:val="18"/>
               </w:rPr>
-              <w:t>알겠어16pt 세 서체·느낌키워드·형태 근거</w:t>
+              <w:t>궁서·주아·붓글씨 예문과 서체를 고르는 방법</w:t>
             </w:r>
           </w:p>
         </w:tc>
@@ -1697,7 +2051,7 @@
                 <w:color w:val="000000"/>
                 <w:sz w:val="18"/>
               </w:rPr>
-              <w:t>01. 말보다 표정</w:t>
+              <w:t>일곱 서체 도감 1</w:t>
             </w:r>
           </w:p>
         </w:tc>
@@ -1730,7 +2084,7 @@
                 <w:color w:val="000000"/>
                 <w:sz w:val="18"/>
               </w:rPr>
-              <w:t>원문 전체와 편집 캡션 / A01</w:t>
+              <w:t>예스체·고딕·명조·은궁서, 같은 진심입니다18pt비교</w:t>
             </w:r>
           </w:p>
         </w:tc>
@@ -1802,7 +2156,7 @@
                 <w:color w:val="000000"/>
                 <w:sz w:val="18"/>
               </w:rPr>
-              <w:t>01. 말보다 표정 — 해설</w:t>
+              <w:t>일곱 서체 도감 2</w:t>
             </w:r>
           </w:p>
         </w:tc>
@@ -1835,7 +2189,7 @@
                 <w:color w:val="000000"/>
                 <w:sz w:val="18"/>
               </w:rPr>
-              <w:t>15pt 세 서체·느낌과 형태 근거·추천과 예문 / A01</w:t>
+              <w:t>주아·나눔붓·둥근모, 같은 진심입니다18pt비교</w:t>
             </w:r>
           </w:p>
         </w:tc>
@@ -1907,7 +2261,7 @@
                 <w:color w:val="000000"/>
                 <w:sz w:val="18"/>
               </w:rPr>
-              <w:t>02. 일단 가보자고</w:t>
+              <w:t>01. 일단 가보자고</w:t>
             </w:r>
           </w:p>
         </w:tc>
@@ -1940,7 +2294,7 @@
                 <w:color w:val="000000"/>
                 <w:sz w:val="18"/>
               </w:rPr>
-              <w:t>원문 전체와 편집 캡션 / B01</w:t>
+              <w:t>표정 제외 텍스트 발췌·편집본 / 선정서체실제적용 / B01</w:t>
             </w:r>
           </w:p>
         </w:tc>
@@ -2012,7 +2366,7 @@
                 <w:color w:val="000000"/>
                 <w:sz w:val="18"/>
               </w:rPr>
-              <w:t>02. 일단 가보자고 — 해설</w:t>
+              <w:t>01. 일단 가보자고 — 해설</w:t>
             </w:r>
           </w:p>
         </w:tc>
@@ -2045,7 +2399,7 @@
                 <w:color w:val="000000"/>
                 <w:sz w:val="18"/>
               </w:rPr>
-              <w:t>15pt 세 서체·느낌과 형태 근거·추천과 예문 / B01</w:t>
+              <w:t>표정 제외 텍스트 발췌·편집본 / 선택3서체의느낌과형태근거 / B01</w:t>
             </w:r>
           </w:p>
         </w:tc>
@@ -2117,7 +2471,7 @@
                 <w:color w:val="000000"/>
                 <w:sz w:val="18"/>
               </w:rPr>
-              <w:t>03. 사랑이 너무 많아</w:t>
+              <w:t>02. 사랑이 너무 많아</w:t>
             </w:r>
           </w:p>
         </w:tc>
@@ -2150,7 +2504,7 @@
                 <w:color w:val="000000"/>
                 <w:sz w:val="18"/>
               </w:rPr>
-              <w:t>원문 전체와 편집 캡션 / A04</w:t>
+              <w:t>원문 전체 / 선정서체실제적용 / A04</w:t>
             </w:r>
           </w:p>
         </w:tc>
@@ -2222,7 +2576,7 @@
                 <w:color w:val="000000"/>
                 <w:sz w:val="18"/>
               </w:rPr>
-              <w:t>03. 사랑이 너무 많아 — 해설</w:t>
+              <w:t>02. 사랑이 너무 많아 — 해설</w:t>
             </w:r>
           </w:p>
         </w:tc>
@@ -2255,7 +2609,7 @@
                 <w:color w:val="000000"/>
                 <w:sz w:val="18"/>
               </w:rPr>
-              <w:t>15pt 세 서체·느낌과 형태 근거·추천과 예문 / A04</w:t>
+              <w:t>원문 전체 / 선택3서체의느낌과형태근거 / A04</w:t>
             </w:r>
           </w:p>
         </w:tc>
@@ -2327,7 +2681,7 @@
                 <w:color w:val="000000"/>
                 <w:sz w:val="18"/>
               </w:rPr>
-              <w:t>04. 칭찬도 정도껏</w:t>
+              <w:t>03. 칭찬도 정도껏</w:t>
             </w:r>
           </w:p>
         </w:tc>
@@ -2360,7 +2714,7 @@
                 <w:color w:val="000000"/>
                 <w:sz w:val="18"/>
               </w:rPr>
-              <w:t>원문 전체와 편집 캡션 / B02</w:t>
+              <w:t>표정 제외 텍스트 발췌·편집본 / 선정서체실제적용 / B02</w:t>
             </w:r>
           </w:p>
         </w:tc>
@@ -2432,7 +2786,7 @@
                 <w:color w:val="000000"/>
                 <w:sz w:val="18"/>
               </w:rPr>
-              <w:t>04. 칭찬도 정도껏 — 해설</w:t>
+              <w:t>03. 칭찬도 정도껏 — 해설</w:t>
             </w:r>
           </w:p>
         </w:tc>
@@ -2465,7 +2819,7 @@
                 <w:color w:val="000000"/>
                 <w:sz w:val="18"/>
               </w:rPr>
-              <w:t>15pt 세 서체·느낌과 형태 근거·추천과 예문 / B02</w:t>
+              <w:t>표정 제외 텍스트 발췌·편집본 / 선택3서체의느낌과형태근거 / B02</w:t>
             </w:r>
           </w:p>
         </w:tc>
@@ -2537,7 +2891,7 @@
                 <w:color w:val="000000"/>
                 <w:sz w:val="18"/>
               </w:rPr>
-              <w:t>05. 축하해. 근데 이제</w:t>
+              <w:t>04. 축하해. 근데 이제</w:t>
             </w:r>
           </w:p>
         </w:tc>
@@ -2570,7 +2924,7 @@
                 <w:color w:val="000000"/>
                 <w:sz w:val="18"/>
               </w:rPr>
-              <w:t>원문 전체와 편집 캡션 / A02</w:t>
+              <w:t>원문 전체 / 선정서체실제적용 / A02</w:t>
             </w:r>
           </w:p>
         </w:tc>
@@ -2642,7 +2996,7 @@
                 <w:color w:val="000000"/>
                 <w:sz w:val="18"/>
               </w:rPr>
-              <w:t>05. 축하해. 근데 이제 — 해설</w:t>
+              <w:t>04. 축하해. 근데 이제 — 해설</w:t>
             </w:r>
           </w:p>
         </w:tc>
@@ -2675,7 +3029,7 @@
                 <w:color w:val="000000"/>
                 <w:sz w:val="18"/>
               </w:rPr>
-              <w:t>15pt 세 서체·느낌과 형태 근거·추천과 예문 / A02</w:t>
+              <w:t>원문 전체 / 선택3서체의느낌과형태근거 / A02</w:t>
             </w:r>
           </w:p>
         </w:tc>
@@ -2747,7 +3101,7 @@
                 <w:color w:val="000000"/>
                 <w:sz w:val="18"/>
               </w:rPr>
-              <w:t>06. 내가 감히</w:t>
+              <w:t>05. 내가 감히</w:t>
             </w:r>
           </w:p>
         </w:tc>
@@ -2780,7 +3134,7 @@
                 <w:color w:val="000000"/>
                 <w:sz w:val="18"/>
               </w:rPr>
-              <w:t>원문전체·13.5pt 세 서체·느낌과 형태 근거·예문 / A03</w:t>
+              <w:t>원문 전체 / 선택3서체의느낌과형태근거 / A03</w:t>
             </w:r>
           </w:p>
         </w:tc>
@@ -2852,7 +3206,7 @@
                 <w:color w:val="000000"/>
                 <w:sz w:val="18"/>
               </w:rPr>
-              <w:t>07. 로맨틱한언어들</w:t>
+              <w:t>06. 로맨틱한언어들</w:t>
             </w:r>
           </w:p>
         </w:tc>
@@ -2885,7 +3239,7 @@
                 <w:color w:val="000000"/>
                 <w:sz w:val="18"/>
               </w:rPr>
-              <w:t>원문전체·13.5pt 세 서체·느낌과 형태 근거·예문 / A10</w:t>
+              <w:t>원문 전체 / 선택3서체의느낌과형태근거 / A10</w:t>
             </w:r>
           </w:p>
         </w:tc>
@@ -2893,7 +3247,7 @@
     </w:tbl>
     <w:p>
       <w:r>
-        <w:t>3쪽의 「알겠어」는 세 서체를 16pt로 비교한다. 펼침면은 15pt, 한 쪽 통합은 13.5pt, 짧은 말 모음은 11pt 견본으로 서체별 인상과 이유를 읽는다. 22–23쪽의 눈물 독백은 원문 자모와 공백을 살리고, 26–27쪽 대사는 같은 말에 붙는 결의와 격식을 비교한다.</w:t>
+        <w:t>비교 견본은 작게 두고 옆에 느낌 키워드와 형태 근거를 붙인다. 같은 지면에서는 글자 크기와 색을 맞추고, 읽기 어려운 장식보다 인상의 차이를 먼저 확인하게 한다.</w:t>
       </w:r>
     </w:p>
     <w:p>
@@ -3095,7 +3449,7 @@
                 <w:color w:val="000000"/>
                 <w:sz w:val="18"/>
               </w:rPr>
-              <w:t>08. 선배 고단수다~</w:t>
+              <w:t>07. 선배 고단수다~</w:t>
             </w:r>
           </w:p>
         </w:tc>
@@ -3128,7 +3482,7 @@
                 <w:color w:val="000000"/>
                 <w:sz w:val="18"/>
               </w:rPr>
-              <w:t>원문 전체와 편집 캡션 / B06</w:t>
+              <w:t>원문 전체 / 선정서체실제적용 / B06</w:t>
             </w:r>
           </w:p>
         </w:tc>
@@ -3200,7 +3554,7 @@
                 <w:color w:val="000000"/>
                 <w:sz w:val="18"/>
               </w:rPr>
-              <w:t>08. 선배 고단수다~ — 해설</w:t>
+              <w:t>07. 선배 고단수다~ — 해설</w:t>
             </w:r>
           </w:p>
         </w:tc>
@@ -3233,7 +3587,7 @@
                 <w:color w:val="000000"/>
                 <w:sz w:val="18"/>
               </w:rPr>
-              <w:t>15pt 세 서체·느낌과 형태 근거·추천과 예문 / B06</w:t>
+              <w:t>원문 전체 / 선택3서체의느낌과형태근거 / B06</w:t>
             </w:r>
           </w:p>
         </w:tc>
@@ -3305,7 +3659,7 @@
                 <w:color w:val="000000"/>
                 <w:sz w:val="18"/>
               </w:rPr>
-              <w:t>09. 입이 쉬지를 않음</w:t>
+              <w:t>08. 입이 쉬지를 않음</w:t>
             </w:r>
           </w:p>
         </w:tc>
@@ -3338,7 +3692,7 @@
                 <w:color w:val="000000"/>
                 <w:sz w:val="18"/>
               </w:rPr>
-              <w:t>원문 전체와 편집 캡션 / B05</w:t>
+              <w:t>원문 전체 / 선정서체실제적용 / B05</w:t>
             </w:r>
           </w:p>
         </w:tc>
@@ -3410,7 +3764,7 @@
                 <w:color w:val="000000"/>
                 <w:sz w:val="18"/>
               </w:rPr>
-              <w:t>09. 입이 쉬지를 않음 — 해설</w:t>
+              <w:t>08. 입이 쉬지를 않음 — 해설</w:t>
             </w:r>
           </w:p>
         </w:tc>
@@ -3443,7 +3797,7 @@
                 <w:color w:val="000000"/>
                 <w:sz w:val="18"/>
               </w:rPr>
-              <w:t>15pt 세 서체·느낌과 형태 근거·추천과 예문 / B05</w:t>
+              <w:t>원문 전체 / 선택3서체의느낌과형태근거 / B05</w:t>
             </w:r>
           </w:p>
         </w:tc>
@@ -3515,7 +3869,7 @@
                 <w:color w:val="000000"/>
                 <w:sz w:val="18"/>
               </w:rPr>
-              <w:t>10. 인정? 어 인정</w:t>
+              <w:t>09. 인정? 어 인정</w:t>
             </w:r>
           </w:p>
         </w:tc>
@@ -3548,7 +3902,7 @@
                 <w:color w:val="000000"/>
                 <w:sz w:val="18"/>
               </w:rPr>
-              <w:t>원문 전체와 편집 캡션 / B03</w:t>
+              <w:t>원문 전체 / 선정서체실제적용 / B03</w:t>
             </w:r>
           </w:p>
         </w:tc>
@@ -3620,7 +3974,7 @@
                 <w:color w:val="000000"/>
                 <w:sz w:val="18"/>
               </w:rPr>
-              <w:t>10. 인정? 어 인정 — 해설</w:t>
+              <w:t>09. 인정? 어 인정 — 해설</w:t>
             </w:r>
           </w:p>
         </w:tc>
@@ -3653,7 +4007,7 @@
                 <w:color w:val="000000"/>
                 <w:sz w:val="18"/>
               </w:rPr>
-              <w:t>15pt 세 서체·느낌과 형태 근거·추천과 예문 / B03</w:t>
+              <w:t>원문 전체 / 선택3서체의느낌과형태근거 / B03</w:t>
             </w:r>
           </w:p>
         </w:tc>
@@ -3725,7 +4079,7 @@
                 <w:color w:val="000000"/>
                 <w:sz w:val="18"/>
               </w:rPr>
-              <w:t>11. 가끔은 눈물을 흘린다</w:t>
+              <w:t>10. 가끔은 눈물을 흘린다</w:t>
             </w:r>
           </w:p>
         </w:tc>
@@ -3758,7 +4112,7 @@
                 <w:color w:val="000000"/>
                 <w:sz w:val="18"/>
               </w:rPr>
-              <w:t>원문 전체와 편집 캡션 / A05</w:t>
+              <w:t>표정 제외 텍스트 발췌·편집본 / 선정서체실제적용 / A05</w:t>
             </w:r>
           </w:p>
         </w:tc>
@@ -3830,7 +4184,7 @@
                 <w:color w:val="000000"/>
                 <w:sz w:val="18"/>
               </w:rPr>
-              <w:t>11. 가끔은 눈물을 흘린다 — 해설</w:t>
+              <w:t>10. 가끔은 눈물을 흘린다 — 해설</w:t>
             </w:r>
           </w:p>
         </w:tc>
@@ -3863,7 +4217,7 @@
                 <w:color w:val="000000"/>
                 <w:sz w:val="18"/>
               </w:rPr>
-              <w:t>15pt 세 서체·느낌과 형태 근거·추천과 예문 / A05</w:t>
+              <w:t>표정 제외 텍스트 발췌·편집본 / 선택3서체의느낌과형태근거 / A05</w:t>
             </w:r>
           </w:p>
         </w:tc>
@@ -3935,7 +4289,7 @@
                 <w:color w:val="000000"/>
                 <w:sz w:val="18"/>
               </w:rPr>
-              <w:t>12. 내일 출근 실화냐</w:t>
+              <w:t>11. 내일 출근 실화냐</w:t>
             </w:r>
           </w:p>
         </w:tc>
@@ -3968,7 +4322,7 @@
                 <w:color w:val="000000"/>
                 <w:sz w:val="18"/>
               </w:rPr>
-              <w:t>원문 전체와 편집 캡션 / B07</w:t>
+              <w:t>원문 전체 / 선정서체실제적용 / B07</w:t>
             </w:r>
           </w:p>
         </w:tc>
@@ -4040,7 +4394,7 @@
                 <w:color w:val="000000"/>
                 <w:sz w:val="18"/>
               </w:rPr>
-              <w:t>12. 내일 출근 실화냐 — 해설</w:t>
+              <w:t>11. 내일 출근 실화냐 — 해설</w:t>
             </w:r>
           </w:p>
         </w:tc>
@@ -4073,7 +4427,7 @@
                 <w:color w:val="000000"/>
                 <w:sz w:val="18"/>
               </w:rPr>
-              <w:t>15pt 세 서체·느낌과 형태 근거·추천과 예문 / B07</w:t>
+              <w:t>원문 전체 / 선택3서체의느낌과형태근거 / B07</w:t>
             </w:r>
           </w:p>
         </w:tc>
@@ -4145,7 +4499,7 @@
                 <w:color w:val="000000"/>
                 <w:sz w:val="18"/>
               </w:rPr>
-              <w:t>13. 난 오늘만 산다</w:t>
+              <w:t>12. 난 오늘만 산다</w:t>
             </w:r>
           </w:p>
         </w:tc>
@@ -4178,7 +4532,7 @@
                 <w:color w:val="000000"/>
                 <w:sz w:val="18"/>
               </w:rPr>
-              <w:t>원문 전체와 편집 캡션 / A06</w:t>
+              <w:t>원문 전체 / 선정서체실제적용 / A06</w:t>
             </w:r>
           </w:p>
         </w:tc>
@@ -4250,7 +4604,7 @@
                 <w:color w:val="000000"/>
                 <w:sz w:val="18"/>
               </w:rPr>
-              <w:t>13. 난 오늘만 산다 — 해설</w:t>
+              <w:t>12. 난 오늘만 산다 — 해설</w:t>
             </w:r>
           </w:p>
         </w:tc>
@@ -4283,7 +4637,7 @@
                 <w:color w:val="000000"/>
                 <w:sz w:val="18"/>
               </w:rPr>
-              <w:t>15pt 세 서체·느낌과 형태 근거·추천과 예문 / A06</w:t>
+              <w:t>원문 전체 / 선택3서체의느낌과형태근거 / A06</w:t>
             </w:r>
           </w:p>
         </w:tc>
@@ -4400,12 +4754,12 @@
         <w:keepNext/>
       </w:pPr>
       <w:r>
-        <w:t>16개 밈과 대사를 28쪽에 담는 방식</w:t>
+        <w:t>15개 밈과 대사를 28쪽에 담는 방식</w:t>
       </w:r>
     </w:p>
     <w:p>
       <w:r>
-        <w:t>2쪽에 「야르」·「밤티」·「이태민이태민이태민」과 상황 예문을 모았다. 14쪽 「내가 감히」와 15쪽 로맨스 독백은 각각 한 쪽으로 묶고, 22–23쪽은 눈물 독백으로 교체했다. 26–27쪽에는 「난 오늘만 산다」를 추가하고 출처는 28쪽으로 옮겼다. 별도 실험실은 각 지면의 비교 견본으로 통합해 총 28쪽을 유지했다.</w:t>
+        <w:t>짧은 세 말은 한 쪽에 모으고 「내가 감히」와 로맨스 독백은 각 한 쪽에 텍스트와 견본을 묶는다. 눈물 독백과 「난 오늘만 산다」 같은 긴 지면은 펼침면으로 구성한다. 표정 AA를 뺀 4–5쪽은 일곱 서체의 차이를 먼저 익히는 도감으로 바꿨다. 출처는 28쪽에 모아 전체 분량을 유지한다.</w:t>
       </w:r>
     </w:p>
     <w:p>
@@ -4419,7 +4773,7 @@
     </w:p>
     <w:p>
       <w:r>
-        <w:t>수집한 밈 원문과 선정한 표지 사진을 사용했다. 최초 게시자와 유행 시점, 추가 대사의 정확한 작품 출처는 확인 전까지 추정해 적지 않는다. 서체 분석은 실제 서체 메타데이터와 현재 지면의 글자 형태를 관찰해 정리했다.</w:t>
+        <w:t>수집한 밈 텍스트와 선정한 표지 사진을 사용했다. 최초 게시자와 유행 시점, 대사의 정확한 작품 출처는 확인 전까지 추정해 적지 않는다. 서체 분석은 실제 글꼴 이름과 현재 지면의 획·자폭·장식·간격을 관찰해 정리한다.</w:t>
       </w:r>
     </w:p>
     <w:p>
@@ -4960,7 +5314,7 @@
     </w:tbl>
     <w:p>
       <w:r>
-        <w:t>출력용 PDF는 지면 검토를 위한 독서 순서 펼침면이다. 중철 제본용으로 페이지를 재배열한 인쇄소 판짜기 파일과 구분한다. 단면으로 출력하고 바깥 재단선만 따라 자른다. 가운데는 자르지 않는다.</w:t>
+        <w:t>출력용 PDF는 수업에서 보는 독서 순서의 펼침면이다. 단면으로 출력하고 바깥 재단선만 자른다. 가운데는 그대로 둔다.</w:t>
       </w:r>
     </w:p>
     <w:p>
@@ -4974,7 +5328,7 @@
     </w:p>
     <w:p>
       <w:r>
-        <w:t>첫 장을 시험 출력한 뒤 자로 한 쪽의 재단선 사이가 148×210mm인지 확인한다. A3 출력물의 기준선도 실제 100mm인지 확인하고, 크기가 맞으면 전체를 출력한다. ‘용지에 맞추기’, ‘큰 페이지 축소’, 소책자 출력은 사용하지 않는다.</w:t>
+        <w:t>첫 장을 시험 출력한 뒤 자로 한 쪽의 재단선 사이가 148×210mm인지 확인한다. A3 출력물의 기준선도 실제 100mm인지 확인하고, 크기가 맞으면 전체를 출력한다. 용지 맞춤, 큰 페이지 축소, 소책자 출력은 사용하지 않는다.</w:t>
       </w:r>
     </w:p>
     <w:p>
@@ -4988,27 +5342,27 @@
     </w:p>
     <w:p>
       <w:r>
-        <w:t>• 친구들에게 나눠줄 선물책이라는 독자와 사용 상황을 구체화했다.</w:t>
+        <w:t>• 표정 이모티콘을 지면에서 제외하고 글자 형태로 감정을 보여주도록 바꿨다.</w:t>
       </w:r>
     </w:p>
     <w:p>
       <w:r>
-        <w:t>• 이모지 밈을 눈물 독백으로 교체하고 짧은 말·로맨스 독백·대사를 더해 16개를 수록했다.</w:t>
+        <w:t>• 서체를 일곱 가지로 넓히고 4–5쪽 도감과 각 밈의 비교 견본에 실제 적용했다.</w:t>
       </w:r>
     </w:p>
     <w:p>
       <w:r>
-        <w:t>• 해설 제목과 견본을 줄이고, 작은 세 서체 견본 옆에 각각의 느낌과 형태적 이유를 넣었다.</w:t>
+        <w:t>• 작은 견본 옆에 느낌과 형태적 이유를 배치해 서체 차이를 읽게 했다.</w:t>
       </w:r>
     </w:p>
     <w:p>
       <w:r>
-        <w:t>• 흰 표지와 선정한 사진을 유지하며 비뚤어진 도장과 요란한 강조색으로 B급 감성을 보완했다.</w:t>
+        <w:t>• 흰 표지와 선정한 사진을 유지하며 도장과 강조색으로 B급 감성을 살렸다.</w:t>
       </w:r>
     </w:p>
     <w:p>
       <w:r>
-        <w:t>• 28쪽 전체 디자인과 A3 실제 크기 출력용 파일을 함께 정리했다.</w:t>
+        <w:t>• 원문 보관과 편집 지면을 나누고 28쪽 전체 디자인과 실제 크기 출력 파일을 정리했다.</w:t>
       </w:r>
     </w:p>
     <w:p>

</xml_diff>